<commit_message>
Update hero & services text copy 100% from Web.docx, add BIM/CAD & Rendering services, and design single-screen viewport 3x2 services grid
</commit_message>
<xml_diff>
--- a/Web.docx
+++ b/Web.docx
@@ -166,93 +166,113 @@
     </w:p>
     <w:p>
       <w:pPr>
-        <w:pStyle w:val="font-claude-response-body"/>
-        <w:rPr>
-          <w:sz w:val="36"/>
-          <w:szCs w:val="36"/>
-        </w:rPr>
-      </w:pPr>
-      <w:r>
-        <w:t>From concept to permit, we deliver drawings and documentation that hold up on t</w:t>
-      </w:r>
-      <w:r>
-        <w:t>he job site — not just on paper.</w:t>
-      </w:r>
-      <w:r>
-        <w:br/>
-      </w:r>
-      <w:r>
-        <w:br/>
-      </w:r>
-      <w:r>
-        <w:br/>
-      </w:r>
-      <w:r>
-        <w:br/>
-      </w:r>
-      <w:r>
-        <w:rPr>
-          <w:rStyle w:val="Strong"/>
-          <w:sz w:val="36"/>
-          <w:szCs w:val="36"/>
-        </w:rPr>
-        <w:t>Structural Engineering</w:t>
-      </w:r>
-    </w:p>
-    <w:p>
-      <w:pPr>
-        <w:pStyle w:val="font-claude-response-body"/>
-        <w:rPr>
+        <w:rPr>
+          <w:b/>
           <w:sz w:val="32"/>
           <w:szCs w:val="32"/>
         </w:rPr>
       </w:pPr>
       <w:r>
-        <w:rPr>
-          <w:rStyle w:val="Strong"/>
+        <w:t>From concept to permit, we deliver drawings and documentation that hold up on t</w:t>
+      </w:r>
+      <w:r>
+        <w:t>he job site — not just on paper.</w:t>
+      </w:r>
+      <w:r>
+        <w:br/>
+      </w:r>
+      <w:r>
+        <w:br/>
+      </w:r>
+      <w:r>
+        <w:br/>
+      </w:r>
+      <w:r>
+        <w:br/>
+      </w:r>
+      <w:r>
+        <w:rPr>
+          <w:rStyle w:val="Strong"/>
+          <w:rFonts w:cstheme="minorHAnsi"/>
+          <w:bCs w:val="0"/>
+          <w:color w:val="000000" w:themeColor="text1"/>
+          <w:sz w:val="28"/>
+          <w:szCs w:val="28"/>
+        </w:rPr>
+        <w:t>Structural Engineering Services</w:t>
+      </w:r>
+      <w:r>
+        <w:rPr>
+          <w:rStyle w:val="Strong"/>
+          <w:rFonts w:cstheme="minorHAnsi"/>
+          <w:bCs w:val="0"/>
+          <w:color w:val="000000" w:themeColor="text1"/>
+          <w:sz w:val="28"/>
+          <w:szCs w:val="28"/>
+        </w:rPr>
+        <w:br/>
+      </w:r>
+      <w:r>
+        <w:rPr>
+          <w:rStyle w:val="Strong"/>
+          <w:rFonts w:cstheme="minorHAnsi"/>
+          <w:bCs w:val="0"/>
+          <w:sz w:val="28"/>
+          <w:szCs w:val="28"/>
+        </w:rPr>
+        <w:br/>
+      </w:r>
+      <w:r>
+        <w:t>Professional structural engineering services for residential, commercial, and industrial projects, providing structural analysis, foundation and framing design, and detailed permit-ready engineering documentation.</w:t>
+      </w:r>
+      <w:r>
+        <w:br/>
+      </w:r>
+      <w:r>
+        <w:br/>
+      </w:r>
+      <w:r>
+        <w:br/>
+      </w:r>
+      <w:r>
+        <w:rPr>
+          <w:b/>
           <w:sz w:val="32"/>
           <w:szCs w:val="32"/>
         </w:rPr>
-        <w:t>Engineering That Carries the Weight</w:t>
-      </w:r>
+        <w:t>Service Overview</w:t>
+      </w:r>
+    </w:p>
+    <w:p>
+      <w:pPr>
+        <w:pStyle w:val="NormalWeb"/>
+      </w:pPr>
+      <w:r>
+        <w:t>At Bid Dimensions, we provide structural engineering solutions focused on safety, performance, efficiency, and code compliance. Whether you're planning new construction, a renovation, a building addition, or a structural modification, we develop practical and efficient structural systems tailored to your project's requirements.</w:t>
+      </w:r>
+    </w:p>
+    <w:p>
+      <w:pPr>
+        <w:pStyle w:val="NormalWeb"/>
+      </w:pPr>
+      <w:r>
+        <w:t>From structural analysis and foundation design to framing, connection design, and detailed construction documentation, our engineering team develops accurate, permit-ready structural drawings and calculations that support efficient construction and provide a reliable foundation for every project.</w:t>
+      </w:r>
+    </w:p>
+    <w:p>
+      <w:pPr>
+        <w:pStyle w:val="NormalWeb"/>
+      </w:pPr>
+    </w:p>
+    <w:p>
+      <w:pPr>
+        <w:pStyle w:val="NormalWeb"/>
+      </w:pPr>
     </w:p>
     <w:p>
       <w:pPr>
         <w:pStyle w:val="font-claude-response-body"/>
-      </w:pPr>
-      <w:r>
-        <w:t>Every structure depends on decisions made long before construction starts — how loads move, how foundations bear, how connections hold. Bid Dimensions handles that work: calculations, foundation design, and PE-stamped drawings that give your project a structural foundation it can actually stand on, in every sense of the word.</w:t>
-      </w:r>
-    </w:p>
-    <w:p>
-      <w:pPr>
-        <w:spacing w:before="100" w:beforeAutospacing="1" w:after="100" w:afterAutospacing="1" w:line="240" w:lineRule="auto"/>
-        <w:outlineLvl w:val="1"/>
-        <w:rPr>
-          <w:rFonts w:ascii="Times New Roman" w:eastAsia="Times New Roman" w:hAnsi="Times New Roman" w:cs="Times New Roman"/>
-          <w:b/>
-          <w:bCs/>
-          <w:sz w:val="32"/>
-          <w:szCs w:val="32"/>
-        </w:rPr>
-      </w:pPr>
-      <w:r>
-        <w:rPr>
-          <w:rFonts w:ascii="Times New Roman" w:eastAsia="Times New Roman" w:hAnsi="Times New Roman" w:cs="Times New Roman"/>
-          <w:b/>
-          <w:bCs/>
-          <w:sz w:val="32"/>
-          <w:szCs w:val="32"/>
-        </w:rPr>
-        <w:t>The Cost of Getting It Wrong</w:t>
-      </w:r>
-    </w:p>
-    <w:p>
-      <w:pPr>
-        <w:spacing w:before="100" w:beforeAutospacing="1" w:after="100" w:afterAutospacing="1" w:line="240" w:lineRule="auto"/>
-        <w:outlineLvl w:val="0"/>
-        <w:rPr>
-          <w:rFonts w:ascii="Times New Roman" w:eastAsia="Times New Roman" w:hAnsi="Times New Roman" w:cs="Times New Roman"/>
+        <w:rPr>
           <w:b/>
           <w:bCs/>
           <w:kern w:val="36"/>
@@ -261,33 +281,10 @@
         </w:rPr>
       </w:pPr>
       <w:r>
-        <w:rPr>
-          <w:rFonts w:ascii="Times New Roman" w:eastAsia="Times New Roman" w:hAnsi="Times New Roman" w:cs="Times New Roman"/>
-          <w:sz w:val="24"/>
-          <w:szCs w:val="24"/>
-        </w:rPr>
-        <w:t>Most structural issues don't begin during construction—they begin during design. An overlooked load path, an undersized foundation, or an uncoordinated detail can lead to costly revisions, project delays, and unexpected challenges in the field. Our engineering process identifies and resolves these issues early, delivering coordinated, code-compliant designs that keep construction moving with confidence.</w:t>
-      </w:r>
-      <w:r>
-        <w:rPr>
-          <w:rFonts w:ascii="Times New Roman" w:eastAsia="Times New Roman" w:hAnsi="Times New Roman" w:cs="Times New Roman"/>
-          <w:sz w:val="24"/>
-          <w:szCs w:val="24"/>
-        </w:rPr>
-        <w:br/>
-      </w:r>
-      <w:r>
-        <w:rPr>
-          <w:rFonts w:ascii="Times New Roman" w:eastAsia="Times New Roman" w:hAnsi="Times New Roman" w:cs="Times New Roman"/>
-          <w:sz w:val="24"/>
-          <w:szCs w:val="24"/>
-        </w:rPr>
-        <w:lastRenderedPageBreak/>
-        <w:br/>
-      </w:r>
-      <w:r>
-        <w:rPr>
-          <w:rFonts w:ascii="Times New Roman" w:eastAsia="Times New Roman" w:hAnsi="Times New Roman" w:cs="Times New Roman"/>
+        <w:br/>
+      </w:r>
+      <w:r>
+        <w:rPr>
           <w:b/>
           <w:bCs/>
           <w:kern w:val="36"/>
@@ -585,6 +582,7 @@
           <w:rFonts w:cstheme="minorHAnsi"/>
           <w:i w:val="0"/>
         </w:rPr>
+        <w:lastRenderedPageBreak/>
         <w:t>Analyze structural loads to develop a safe, efficient, and code-compliant structural system</w:t>
       </w:r>
       <w:r>
@@ -624,7 +622,6 @@
           <w:rFonts w:cstheme="minorHAnsi"/>
           <w:i w:val="0"/>
         </w:rPr>
-        <w:lastRenderedPageBreak/>
         <w:t>Determine the most suitable foundation system based on soil conditions, structural loads, and project requirements</w:t>
       </w:r>
       <w:r>
@@ -1075,26 +1072,7 @@
           <w:szCs w:val="36"/>
         </w:rPr>
         <w:br/>
-        <w:t>FAQ’s</w:t>
-      </w:r>
-      <w:r>
-        <w:br/>
-      </w:r>
-    </w:p>
-    <w:p>
-      <w:pPr>
-        <w:spacing w:before="100" w:beforeAutospacing="1" w:after="100" w:afterAutospacing="1" w:line="240" w:lineRule="auto"/>
-        <w:rPr>
-          <w:rFonts w:ascii="Times New Roman" w:eastAsia="Times New Roman" w:hAnsi="Times New Roman" w:cs="Times New Roman"/>
-          <w:sz w:val="24"/>
-          <w:szCs w:val="24"/>
-        </w:rPr>
-      </w:pPr>
-    </w:p>
-    <w:p>
-      <w:pPr>
-        <w:pStyle w:val="font-claude-response-body"/>
-      </w:pPr>
+      </w:r>
       <w:r>
         <w:rPr>
           <w:b/>
@@ -1102,7 +1080,66 @@
           <w:szCs w:val="36"/>
         </w:rPr>
         <w:lastRenderedPageBreak/>
+        <w:t>FAQ’s</w:t>
+      </w:r>
+      <w:r>
+        <w:br/>
+      </w:r>
+    </w:p>
+    <w:p>
+      <w:pPr>
+        <w:spacing w:before="100" w:beforeAutospacing="1" w:after="100" w:afterAutospacing="1" w:line="240" w:lineRule="auto"/>
+        <w:rPr>
+          <w:rFonts w:ascii="Times New Roman" w:eastAsia="Times New Roman" w:hAnsi="Times New Roman" w:cs="Times New Roman"/>
+          <w:sz w:val="24"/>
+          <w:szCs w:val="24"/>
+        </w:rPr>
+      </w:pPr>
+    </w:p>
+    <w:p>
+      <w:pPr>
+        <w:pStyle w:val="font-claude-response-body"/>
+      </w:pPr>
+      <w:r>
+        <w:rPr>
+          <w:b/>
+          <w:sz w:val="36"/>
+          <w:szCs w:val="36"/>
+        </w:rPr>
         <w:t>Architectural Design Services</w:t>
+      </w:r>
+      <w:r>
+        <w:rPr>
+          <w:b/>
+          <w:sz w:val="36"/>
+          <w:szCs w:val="36"/>
+        </w:rPr>
+        <w:br/>
+      </w:r>
+      <w:r>
+        <w:rPr>
+          <w:b/>
+          <w:sz w:val="36"/>
+          <w:szCs w:val="36"/>
+        </w:rPr>
+        <w:br/>
+      </w:r>
+      <w:r>
+        <w:t>Professional architectural design solutions for residential, commercial, and industrial projects, from concept development and floor plans to detailed, permit-ready construction drawings.</w:t>
+      </w:r>
+      <w:r>
+        <w:br/>
+      </w:r>
+      <w:r>
+        <w:br/>
+      </w:r>
+      <w:r>
+        <w:rPr>
+          <w:b/>
+          <w:sz w:val="32"/>
+          <w:szCs w:val="32"/>
+        </w:rPr>
+        <w:t>Service Overview</w:t>
       </w:r>
       <w:r>
         <w:rPr>
@@ -1296,6 +1333,7 @@
           <w:sz w:val="28"/>
           <w:szCs w:val="28"/>
         </w:rPr>
+        <w:lastRenderedPageBreak/>
         <w:t>Real Estate Investors</w:t>
       </w:r>
     </w:p>
@@ -1371,7 +1409,6 @@
           <w:sz w:val="28"/>
           <w:szCs w:val="28"/>
         </w:rPr>
-        <w:lastRenderedPageBreak/>
         <w:t>1. Project Consultation</w:t>
       </w:r>
     </w:p>
@@ -1590,6 +1627,7 @@
         <w:spacing w:before="100" w:beforeAutospacing="1" w:after="100" w:afterAutospacing="1" w:line="240" w:lineRule="auto"/>
       </w:pPr>
       <w:r>
+        <w:lastRenderedPageBreak/>
         <w:t>Site Plans</w:t>
       </w:r>
     </w:p>
@@ -1718,7 +1756,6 @@
         <w:pStyle w:val="Heading2"/>
       </w:pPr>
       <w:r>
-        <w:lastRenderedPageBreak/>
         <w:t>Design Software</w:t>
       </w:r>
     </w:p>
@@ -1907,7 +1944,7 @@
     <w:p/>
     <w:p/>
     <w:p>
-      <w:pPr>
+      <w:r>
         <w:rPr>
           <w:rFonts w:ascii="Times New Roman" w:hAnsi="Times New Roman" w:cs="Times New Roman"/>
           <w:b/>
@@ -1915,7 +1952,8 @@
           <w:szCs w:val="32"/>
           <w:u w:val="single"/>
         </w:rPr>
-      </w:pPr>
+        <w:t>MEP Engineering</w:t>
+      </w:r>
       <w:r>
         <w:rPr>
           <w:rFonts w:ascii="Times New Roman" w:hAnsi="Times New Roman" w:cs="Times New Roman"/>
@@ -1924,209 +1962,237 @@
           <w:szCs w:val="32"/>
           <w:u w:val="single"/>
         </w:rPr>
-        <w:t>MEP Engineering Services</w:t>
-      </w:r>
-    </w:p>
-    <w:p>
-      <w:r>
-        <w:br/>
-        <w:t>At Bid Dimensions, we provide licensed MEP engineering services that deliver efficient, coordinated, and code-compliant mechanical, electrical, and plumbing designs for residential, commercial, and industrial projects.</w:t>
-      </w:r>
-    </w:p>
-    <w:p>
-      <w:r>
-        <w:t xml:space="preserve">Our multidisciplinary approach ensures every MEP system is fully coordinated with the architectural and structural design before construction begins. By identifying potential conflicts early, optimizing system </w:t>
-      </w:r>
-      <w:r>
-        <w:lastRenderedPageBreak/>
-        <w:t>layouts, and preparing permit-ready documentation, we help minimize costly revisions, simplify the permitting process, and support efficient construction from start to finish.</w:t>
-      </w:r>
-    </w:p>
-    <w:p/>
-    <w:p>
-      <w:pPr>
-        <w:pStyle w:val="Heading2"/>
-      </w:pPr>
-      <w:r>
-        <w:t>Project Deliverables</w:t>
-      </w:r>
-    </w:p>
-    <w:p>
-      <w:pPr>
-        <w:pStyle w:val="isselectedend"/>
-      </w:pPr>
-      <w:r>
-        <w:t>Depending on your project's scope and requirements, your MEP engineering package may include:</w:t>
-      </w:r>
-    </w:p>
-    <w:p>
-      <w:pPr>
-        <w:numPr>
-          <w:ilvl w:val="0"/>
-          <w:numId w:val="4"/>
-        </w:numPr>
-        <w:spacing w:before="100" w:beforeAutospacing="1" w:after="100" w:afterAutospacing="1" w:line="240" w:lineRule="auto"/>
-      </w:pPr>
-      <w:r>
-        <w:t>HVAC Plans &amp; Equipment Layouts</w:t>
-      </w:r>
-    </w:p>
-    <w:p>
-      <w:pPr>
-        <w:numPr>
-          <w:ilvl w:val="0"/>
-          <w:numId w:val="4"/>
-        </w:numPr>
-        <w:spacing w:before="100" w:beforeAutospacing="1" w:after="100" w:afterAutospacing="1" w:line="240" w:lineRule="auto"/>
-      </w:pPr>
-      <w:r>
-        <w:t>Air Distribution &amp; Ductwork Plans</w:t>
-      </w:r>
-    </w:p>
-    <w:p>
-      <w:pPr>
-        <w:numPr>
-          <w:ilvl w:val="0"/>
-          <w:numId w:val="4"/>
-        </w:numPr>
-        <w:spacing w:before="100" w:beforeAutospacing="1" w:after="100" w:afterAutospacing="1" w:line="240" w:lineRule="auto"/>
-      </w:pPr>
-      <w:r>
-        <w:t>Electrical Power &amp; Lighting Plans</w:t>
-      </w:r>
-    </w:p>
-    <w:p>
-      <w:pPr>
-        <w:numPr>
-          <w:ilvl w:val="0"/>
-          <w:numId w:val="4"/>
-        </w:numPr>
-        <w:spacing w:before="100" w:beforeAutospacing="1" w:after="100" w:afterAutospacing="1" w:line="240" w:lineRule="auto"/>
-      </w:pPr>
-      <w:r>
-        <w:t>Single-Line Diagrams</w:t>
-      </w:r>
-    </w:p>
-    <w:p>
-      <w:pPr>
-        <w:numPr>
-          <w:ilvl w:val="0"/>
-          <w:numId w:val="4"/>
-        </w:numPr>
-        <w:spacing w:before="100" w:beforeAutospacing="1" w:after="100" w:afterAutospacing="1" w:line="240" w:lineRule="auto"/>
-      </w:pPr>
-      <w:r>
-        <w:t>Panel Schedules &amp; Load Calculations</w:t>
-      </w:r>
-    </w:p>
-    <w:p>
-      <w:pPr>
-        <w:numPr>
-          <w:ilvl w:val="0"/>
-          <w:numId w:val="4"/>
-        </w:numPr>
-        <w:spacing w:before="100" w:beforeAutospacing="1" w:after="100" w:afterAutospacing="1" w:line="240" w:lineRule="auto"/>
-      </w:pPr>
-      <w:r>
-        <w:t>Plumbing Plans &amp; Piping Layouts</w:t>
-      </w:r>
-    </w:p>
-    <w:p>
-      <w:pPr>
-        <w:numPr>
-          <w:ilvl w:val="0"/>
-          <w:numId w:val="4"/>
-        </w:numPr>
-        <w:spacing w:before="100" w:beforeAutospacing="1" w:after="100" w:afterAutospacing="1" w:line="240" w:lineRule="auto"/>
-      </w:pPr>
-      <w:r>
-        <w:t>Water Supply &amp; Drainage Systems</w:t>
-      </w:r>
-    </w:p>
-    <w:p>
-      <w:pPr>
-        <w:numPr>
-          <w:ilvl w:val="0"/>
-          <w:numId w:val="4"/>
-        </w:numPr>
-        <w:spacing w:before="100" w:beforeAutospacing="1" w:after="100" w:afterAutospacing="1" w:line="240" w:lineRule="auto"/>
-      </w:pPr>
-      <w:r>
-        <w:t>Fire Protection Coordination</w:t>
-      </w:r>
-    </w:p>
-    <w:p>
-      <w:pPr>
-        <w:numPr>
-          <w:ilvl w:val="0"/>
-          <w:numId w:val="4"/>
-        </w:numPr>
-        <w:spacing w:before="100" w:beforeAutospacing="1" w:after="100" w:afterAutospacing="1" w:line="240" w:lineRule="auto"/>
-      </w:pPr>
-      <w:r>
-        <w:t>Mechanical, Electrical &amp; Plumbing Details</w:t>
-      </w:r>
-    </w:p>
-    <w:p>
-      <w:pPr>
-        <w:numPr>
-          <w:ilvl w:val="0"/>
-          <w:numId w:val="4"/>
-        </w:numPr>
-        <w:spacing w:before="100" w:beforeAutospacing="1" w:after="100" w:afterAutospacing="1" w:line="240" w:lineRule="auto"/>
-      </w:pPr>
-      <w:r>
-        <w:t>Equipment Schedules</w:t>
-      </w:r>
-    </w:p>
-    <w:p>
-      <w:pPr>
-        <w:numPr>
-          <w:ilvl w:val="0"/>
-          <w:numId w:val="4"/>
-        </w:numPr>
-        <w:spacing w:before="100" w:beforeAutospacing="1" w:after="100" w:afterAutospacing="1" w:line="240" w:lineRule="auto"/>
-      </w:pPr>
-      <w:r>
-        <w:t>MEP Coordination Drawings</w:t>
-      </w:r>
-    </w:p>
-    <w:p>
-      <w:pPr>
-        <w:numPr>
-          <w:ilvl w:val="0"/>
-          <w:numId w:val="4"/>
-        </w:numPr>
-        <w:spacing w:before="100" w:beforeAutospacing="1" w:after="100" w:afterAutospacing="1" w:line="240" w:lineRule="auto"/>
-      </w:pPr>
-      <w:r>
-        <w:t>Energy Compliance Documentation</w:t>
-      </w:r>
-    </w:p>
-    <w:p>
-      <w:pPr>
-        <w:spacing w:before="100" w:beforeAutospacing="1" w:after="100" w:afterAutospacing="1" w:line="240" w:lineRule="auto"/>
-        <w:ind w:left="720"/>
-      </w:pPr>
-    </w:p>
-    <w:p>
-      <w:pPr>
-        <w:spacing w:before="100" w:beforeAutospacing="1" w:after="100" w:afterAutospacing="1" w:line="240" w:lineRule="auto"/>
-        <w:ind w:left="720"/>
+        <w:br/>
+      </w:r>
+      <w:r>
         <w:rPr>
           <w:rFonts w:ascii="Times New Roman" w:hAnsi="Times New Roman" w:cs="Times New Roman"/>
           <w:b/>
           <w:sz w:val="32"/>
           <w:szCs w:val="32"/>
-        </w:rPr>
-      </w:pPr>
-      <w:r>
-        <w:rPr>
-          <w:rFonts w:ascii="Times New Roman" w:hAnsi="Times New Roman" w:cs="Times New Roman"/>
+          <w:u w:val="single"/>
+        </w:rPr>
+        <w:br/>
+      </w:r>
+      <w:r>
+        <w:t>Professional MEP engineering solutions for residential, commercial, and industrial projects, covering mechanical, electrical, and plumbing systems with coordinated, permit-ready designs.</w:t>
+      </w:r>
+      <w:r>
+        <w:br/>
+      </w:r>
+      <w:r>
+        <w:br/>
+      </w:r>
+      <w:r>
+        <w:rPr>
           <w:b/>
           <w:sz w:val="32"/>
           <w:szCs w:val="32"/>
         </w:rPr>
+        <w:t>Service Overview</w:t>
+      </w:r>
+      <w:r>
+        <w:rPr>
+          <w:b/>
+          <w:sz w:val="32"/>
+          <w:szCs w:val="32"/>
+        </w:rPr>
+        <w:br/>
+      </w:r>
+      <w:r>
+        <w:t>At Bid Dimensions, we provide licensed MEP engineering services that deliver efficient, coordinated, and code-compliant mechanical, electrical, and plumbing designs for residential, commercial, and industrial projects.</w:t>
+      </w:r>
+    </w:p>
+    <w:p>
+      <w:r>
+        <w:t>Our multidisciplinary approach ensures every MEP system is fully coordinated with the architectural and structural design before construction begins. By identifying potential conflicts early, optimizing system layouts, and preparing permit-ready documentation, we help minimize costly revisions, simplify the permitting process, and support efficient construction from start to finish.</w:t>
+      </w:r>
+    </w:p>
+    <w:p/>
+    <w:p>
+      <w:pPr>
+        <w:pStyle w:val="Heading2"/>
+      </w:pPr>
+      <w:r>
+        <w:t>Project Deliverables</w:t>
+      </w:r>
+    </w:p>
+    <w:p>
+      <w:pPr>
+        <w:pStyle w:val="isselectedend"/>
+      </w:pPr>
+      <w:r>
+        <w:t>Depending on your project's scope and requirements, your MEP engineering package may include:</w:t>
+      </w:r>
+    </w:p>
+    <w:p>
+      <w:pPr>
+        <w:numPr>
+          <w:ilvl w:val="0"/>
+          <w:numId w:val="4"/>
+        </w:numPr>
+        <w:spacing w:before="100" w:beforeAutospacing="1" w:after="100" w:afterAutospacing="1" w:line="240" w:lineRule="auto"/>
+      </w:pPr>
+      <w:r>
+        <w:t>HVAC Plans &amp; Equipment Layouts</w:t>
+      </w:r>
+    </w:p>
+    <w:p>
+      <w:pPr>
+        <w:numPr>
+          <w:ilvl w:val="0"/>
+          <w:numId w:val="4"/>
+        </w:numPr>
+        <w:spacing w:before="100" w:beforeAutospacing="1" w:after="100" w:afterAutospacing="1" w:line="240" w:lineRule="auto"/>
+      </w:pPr>
+      <w:r>
+        <w:t>Air Distribution &amp; Ductwork Plans</w:t>
+      </w:r>
+    </w:p>
+    <w:p>
+      <w:pPr>
+        <w:numPr>
+          <w:ilvl w:val="0"/>
+          <w:numId w:val="4"/>
+        </w:numPr>
+        <w:spacing w:before="100" w:beforeAutospacing="1" w:after="100" w:afterAutospacing="1" w:line="240" w:lineRule="auto"/>
+      </w:pPr>
+      <w:r>
+        <w:t>Electrical Power &amp; Lighting Plans</w:t>
+      </w:r>
+    </w:p>
+    <w:p>
+      <w:pPr>
+        <w:numPr>
+          <w:ilvl w:val="0"/>
+          <w:numId w:val="4"/>
+        </w:numPr>
+        <w:spacing w:before="100" w:beforeAutospacing="1" w:after="100" w:afterAutospacing="1" w:line="240" w:lineRule="auto"/>
+      </w:pPr>
+      <w:r>
+        <w:t>Single-Line Diagrams</w:t>
+      </w:r>
+    </w:p>
+    <w:p>
+      <w:pPr>
+        <w:numPr>
+          <w:ilvl w:val="0"/>
+          <w:numId w:val="4"/>
+        </w:numPr>
+        <w:spacing w:before="100" w:beforeAutospacing="1" w:after="100" w:afterAutospacing="1" w:line="240" w:lineRule="auto"/>
+      </w:pPr>
+      <w:r>
+        <w:t>Panel Schedules &amp; Load Calculations</w:t>
+      </w:r>
+    </w:p>
+    <w:p>
+      <w:pPr>
+        <w:numPr>
+          <w:ilvl w:val="0"/>
+          <w:numId w:val="4"/>
+        </w:numPr>
+        <w:spacing w:before="100" w:beforeAutospacing="1" w:after="100" w:afterAutospacing="1" w:line="240" w:lineRule="auto"/>
+      </w:pPr>
+      <w:r>
+        <w:t>Plumbing Plans &amp; Piping Layouts</w:t>
+      </w:r>
+    </w:p>
+    <w:p>
+      <w:pPr>
+        <w:numPr>
+          <w:ilvl w:val="0"/>
+          <w:numId w:val="4"/>
+        </w:numPr>
+        <w:spacing w:before="100" w:beforeAutospacing="1" w:after="100" w:afterAutospacing="1" w:line="240" w:lineRule="auto"/>
+      </w:pPr>
+      <w:r>
+        <w:t>Water Supply &amp; Drainage Systems</w:t>
+      </w:r>
+    </w:p>
+    <w:p>
+      <w:pPr>
+        <w:numPr>
+          <w:ilvl w:val="0"/>
+          <w:numId w:val="4"/>
+        </w:numPr>
+        <w:spacing w:before="100" w:beforeAutospacing="1" w:after="100" w:afterAutospacing="1" w:line="240" w:lineRule="auto"/>
+      </w:pPr>
+      <w:r>
+        <w:t>Fire Protection Coordination</w:t>
+      </w:r>
+    </w:p>
+    <w:p>
+      <w:pPr>
+        <w:numPr>
+          <w:ilvl w:val="0"/>
+          <w:numId w:val="4"/>
+        </w:numPr>
+        <w:spacing w:before="100" w:beforeAutospacing="1" w:after="100" w:afterAutospacing="1" w:line="240" w:lineRule="auto"/>
+      </w:pPr>
+      <w:r>
+        <w:t>Mechanical, Electrical &amp; Plumbing Details</w:t>
+      </w:r>
+    </w:p>
+    <w:p>
+      <w:pPr>
+        <w:numPr>
+          <w:ilvl w:val="0"/>
+          <w:numId w:val="4"/>
+        </w:numPr>
+        <w:spacing w:before="100" w:beforeAutospacing="1" w:after="100" w:afterAutospacing="1" w:line="240" w:lineRule="auto"/>
+      </w:pPr>
+      <w:r>
+        <w:t>Equipment Schedules</w:t>
+      </w:r>
+    </w:p>
+    <w:p>
+      <w:pPr>
+        <w:numPr>
+          <w:ilvl w:val="0"/>
+          <w:numId w:val="4"/>
+        </w:numPr>
+        <w:spacing w:before="100" w:beforeAutospacing="1" w:after="100" w:afterAutospacing="1" w:line="240" w:lineRule="auto"/>
+      </w:pPr>
+      <w:r>
+        <w:t>MEP Coordination Drawings</w:t>
+      </w:r>
+    </w:p>
+    <w:p>
+      <w:pPr>
+        <w:numPr>
+          <w:ilvl w:val="0"/>
+          <w:numId w:val="4"/>
+        </w:numPr>
+        <w:spacing w:before="100" w:beforeAutospacing="1" w:after="100" w:afterAutospacing="1" w:line="240" w:lineRule="auto"/>
+      </w:pPr>
+      <w:r>
+        <w:t>Energy Compliance Documentation</w:t>
+      </w:r>
+    </w:p>
+    <w:p>
+      <w:pPr>
+        <w:spacing w:before="100" w:beforeAutospacing="1" w:after="100" w:afterAutospacing="1" w:line="240" w:lineRule="auto"/>
+        <w:ind w:left="720"/>
+      </w:pPr>
+    </w:p>
+    <w:p>
+      <w:pPr>
+        <w:spacing w:before="100" w:beforeAutospacing="1" w:after="100" w:afterAutospacing="1" w:line="240" w:lineRule="auto"/>
+        <w:ind w:left="720"/>
+        <w:rPr>
+          <w:rFonts w:ascii="Times New Roman" w:hAnsi="Times New Roman" w:cs="Times New Roman"/>
+          <w:b/>
+          <w:sz w:val="32"/>
+          <w:szCs w:val="32"/>
+        </w:rPr>
+      </w:pPr>
+      <w:r>
+        <w:rPr>
+          <w:rFonts w:ascii="Times New Roman" w:hAnsi="Times New Roman" w:cs="Times New Roman"/>
+          <w:b/>
+          <w:sz w:val="32"/>
+          <w:szCs w:val="32"/>
+        </w:rPr>
         <w:t>Design Technology</w:t>
       </w:r>
     </w:p>
@@ -2189,6 +2255,7 @@
           <w:sz w:val="24"/>
           <w:szCs w:val="24"/>
         </w:rPr>
+        <w:lastRenderedPageBreak/>
         <w:t>AutoCAD MEP</w:t>
       </w:r>
     </w:p>
@@ -2343,14 +2410,15 @@
           <w:sz w:val="28"/>
           <w:szCs w:val="28"/>
         </w:rPr>
-        <w:lastRenderedPageBreak/>
         <w:t>Is fire protection design included in your MEP services?</w:t>
       </w:r>
     </w:p>
     <w:p>
-      <w:r>
-        <w:rPr>
-          <w:rFonts w:ascii="Times New Roman" w:hAnsi="Times New Roman" w:cs="Times New Roman"/>
+      <w:pPr>
+        <w:pStyle w:val="pdq2pgselectionanchorcontainer"/>
+      </w:pPr>
+      <w:r>
+        <w:rPr>
           <w:sz w:val="28"/>
           <w:szCs w:val="28"/>
         </w:rPr>
@@ -2359,9 +2427,1935 @@
       <w:r>
         <w:t>Yes. We provide fire protection system design and coordination, including sprinkler layouts, riser diagrams, and supporting documentation, where required by the project scope and applicable codes.</w:t>
       </w:r>
+      <w:r>
+        <w:br/>
+      </w:r>
+      <w:r>
+        <w:br/>
+      </w:r>
+      <w:r>
+        <w:br/>
+      </w:r>
+      <w:r>
+        <w:br/>
+      </w:r>
+      <w:r>
+        <w:br/>
+      </w:r>
+      <w:r>
+        <w:br/>
+      </w:r>
+      <w:r>
+        <w:br/>
+      </w:r>
+      <w:r>
+        <w:br/>
+      </w:r>
+      <w:r>
+        <w:rPr>
+          <w:b/>
+          <w:sz w:val="28"/>
+          <w:szCs w:val="28"/>
+        </w:rPr>
+        <w:t>BIM &amp; CAD Services</w:t>
+      </w:r>
+      <w:r>
+        <w:rPr>
+          <w:b/>
+          <w:sz w:val="28"/>
+          <w:szCs w:val="28"/>
+        </w:rPr>
+        <w:br/>
+      </w:r>
+      <w:r>
+        <w:rPr>
+          <w:b/>
+          <w:sz w:val="28"/>
+          <w:szCs w:val="28"/>
+        </w:rPr>
+        <w:br/>
+      </w:r>
+      <w:r>
+        <w:t>Accurate BIM &amp; CAD solutions for contractors and developers, including Revit modeling, CAD drafting, shop drawings, and clash detection to identify and resolve conflicts before construction.</w:t>
+      </w:r>
+      <w:r>
+        <w:br/>
+      </w:r>
+      <w:r>
+        <w:br/>
+      </w:r>
+      <w:r>
+        <w:br/>
+      </w:r>
+      <w:r>
+        <w:rPr>
+          <w:b/>
+        </w:rPr>
+        <w:t>Service Overview</w:t>
+      </w:r>
+      <w:r>
+        <w:br/>
+      </w:r>
+      <w:r>
+        <w:br/>
+        <w:t>Our BIM and CAD services turn design information into accurate, coordinated, and usable project documentation. We develop models and drawings that help identify design issues, improve communication between trades, and provide contractors with reliable information for construction.</w:t>
+      </w:r>
+    </w:p>
+    <w:p>
+      <w:pPr>
+        <w:pStyle w:val="NormalWeb"/>
+      </w:pPr>
+      <w:r>
+        <w:t>Whether you need a new BIM model, CAD drafting, shop drawings, coordination support, or as-built documentation, our team delivers solutions based on your project's scope and requirements.</w:t>
+      </w:r>
+    </w:p>
+    <w:p>
+      <w:pPr>
+        <w:pStyle w:val="Heading2"/>
+      </w:pPr>
+      <w:r>
+        <w:rPr>
+          <w:rStyle w:val="Strong"/>
+          <w:b/>
+          <w:bCs/>
+        </w:rPr>
+        <w:t>Who We Work With</w:t>
+      </w:r>
+    </w:p>
+    <w:p>
+      <w:pPr>
+        <w:pStyle w:val="Heading3"/>
+        <w:rPr>
+          <w:rFonts w:asciiTheme="minorHAnsi" w:hAnsiTheme="minorHAnsi" w:cstheme="minorHAnsi"/>
+          <w:color w:val="auto"/>
+        </w:rPr>
+      </w:pPr>
+      <w:r>
+        <w:rPr>
+          <w:rStyle w:val="Strong"/>
+          <w:rFonts w:asciiTheme="minorHAnsi" w:hAnsiTheme="minorHAnsi" w:cstheme="minorHAnsi"/>
+          <w:bCs w:val="0"/>
+          <w:color w:val="auto"/>
+        </w:rPr>
+        <w:lastRenderedPageBreak/>
+        <w:t>General Contractors</w:t>
+      </w:r>
+    </w:p>
+    <w:p>
+      <w:pPr>
+        <w:pStyle w:val="NormalWeb"/>
+      </w:pPr>
+      <w:r>
+        <w:t>We provide coordinated BIM models, construction drawings, and shop drawings to support planning, installation, and project coordination.</w:t>
+      </w:r>
+    </w:p>
+    <w:p>
+      <w:pPr>
+        <w:pStyle w:val="Heading3"/>
+        <w:rPr>
+          <w:rFonts w:asciiTheme="minorHAnsi" w:hAnsiTheme="minorHAnsi" w:cstheme="minorHAnsi"/>
+          <w:color w:val="auto"/>
+        </w:rPr>
+      </w:pPr>
+      <w:r>
+        <w:rPr>
+          <w:rStyle w:val="Strong"/>
+          <w:rFonts w:asciiTheme="minorHAnsi" w:hAnsiTheme="minorHAnsi" w:cstheme="minorHAnsi"/>
+          <w:bCs w:val="0"/>
+          <w:color w:val="auto"/>
+        </w:rPr>
+        <w:t>Subcontractors</w:t>
+      </w:r>
+    </w:p>
+    <w:p>
+      <w:pPr>
+        <w:pStyle w:val="NormalWeb"/>
+      </w:pPr>
+      <w:r>
+        <w:t>We create detailed trade-specific drawings and models for mechanical, electrical, plumbing, structural, and architectural scopes.</w:t>
+      </w:r>
+    </w:p>
+    <w:p>
+      <w:pPr>
+        <w:rPr>
+          <w:sz w:val="24"/>
+          <w:szCs w:val="24"/>
+        </w:rPr>
+      </w:pPr>
+      <w:r>
+        <w:rPr>
+          <w:rStyle w:val="Strong"/>
+          <w:bCs w:val="0"/>
+          <w:sz w:val="24"/>
+          <w:szCs w:val="24"/>
+        </w:rPr>
+        <w:t>Developers</w:t>
+      </w:r>
+    </w:p>
+    <w:p>
+      <w:pPr>
+        <w:pStyle w:val="NormalWeb"/>
+      </w:pPr>
+      <w:r>
+        <w:t>We develop accurate digital models and project documentation that support design review, construction planning, and project management.</w:t>
+      </w:r>
+    </w:p>
+    <w:p>
+      <w:pPr>
+        <w:rPr>
+          <w:sz w:val="24"/>
+          <w:szCs w:val="24"/>
+        </w:rPr>
+      </w:pPr>
+      <w:r>
+        <w:rPr>
+          <w:rStyle w:val="Strong"/>
+          <w:bCs w:val="0"/>
+          <w:sz w:val="24"/>
+          <w:szCs w:val="24"/>
+        </w:rPr>
+        <w:t>Architects &amp; Engineers</w:t>
+      </w:r>
+    </w:p>
+    <w:p>
+      <w:pPr>
+        <w:pStyle w:val="NormalWeb"/>
+      </w:pPr>
+      <w:r>
+        <w:t>We provide additional BIM and CAD production support, including modeling, drafting, detailing, and documentation</w:t>
+      </w:r>
+    </w:p>
+    <w:p>
+      <w:pPr>
+        <w:rPr>
+          <w:sz w:val="28"/>
+          <w:szCs w:val="28"/>
+        </w:rPr>
+      </w:pPr>
+      <w:r>
+        <w:rPr>
+          <w:rStyle w:val="Strong"/>
+          <w:bCs w:val="0"/>
+          <w:sz w:val="28"/>
+          <w:szCs w:val="28"/>
+        </w:rPr>
+        <w:t>Our BIM &amp; CAD Process</w:t>
+      </w:r>
+    </w:p>
+    <w:p>
+      <w:r>
+        <w:rPr>
+          <w:rStyle w:val="Strong"/>
+        </w:rPr>
+        <w:t>A structured six-step workflow for accurate modeling and clear project documentation.</w:t>
+      </w:r>
+    </w:p>
+    <w:p>
+      <w:pPr>
+        <w:rPr>
+          <w:sz w:val="24"/>
+          <w:szCs w:val="24"/>
+        </w:rPr>
+      </w:pPr>
+      <w:r>
+        <w:rPr>
+          <w:rStyle w:val="Strong"/>
+          <w:bCs w:val="0"/>
+          <w:sz w:val="24"/>
+          <w:szCs w:val="24"/>
+        </w:rPr>
+        <w:t>1. Project Review</w:t>
+      </w:r>
+    </w:p>
+    <w:p>
+      <w:r>
+        <w:t>Review the available drawings, models, specifications, and project requirements to establish the scope.</w:t>
+      </w:r>
+    </w:p>
+    <w:p>
+      <w:pPr>
+        <w:rPr>
+          <w:sz w:val="24"/>
+          <w:szCs w:val="24"/>
+        </w:rPr>
+      </w:pPr>
+      <w:r>
+        <w:rPr>
+          <w:rStyle w:val="Strong"/>
+          <w:bCs w:val="0"/>
+          <w:sz w:val="24"/>
+          <w:szCs w:val="24"/>
+        </w:rPr>
+        <w:t>2. Model &amp; CAD Setup</w:t>
+      </w:r>
+    </w:p>
+    <w:p>
+      <w:r>
+        <w:t>Set up project standards, levels, grids, coordinates, layers, and drawing templates.</w:t>
+      </w:r>
+    </w:p>
+    <w:p>
+      <w:pPr>
+        <w:rPr>
+          <w:sz w:val="24"/>
+          <w:szCs w:val="24"/>
+        </w:rPr>
+      </w:pPr>
+      <w:r>
+        <w:rPr>
+          <w:rStyle w:val="Strong"/>
+          <w:bCs w:val="0"/>
+          <w:sz w:val="24"/>
+          <w:szCs w:val="24"/>
+        </w:rPr>
+        <w:t>3. Modeling &amp; Drafting</w:t>
+      </w:r>
+    </w:p>
+    <w:p>
+      <w:r>
+        <w:t>Develop 2D CAD drawings or 3D BIM models based on the project's requirements and available information.</w:t>
+      </w:r>
+    </w:p>
+    <w:p>
+      <w:pPr>
+        <w:rPr>
+          <w:sz w:val="24"/>
+          <w:szCs w:val="24"/>
+        </w:rPr>
+      </w:pPr>
+      <w:r>
+        <w:rPr>
+          <w:rStyle w:val="Strong"/>
+          <w:bCs w:val="0"/>
+          <w:sz w:val="24"/>
+          <w:szCs w:val="24"/>
+        </w:rPr>
+        <w:t>4. Coordination</w:t>
+      </w:r>
+    </w:p>
+    <w:p>
+      <w:r>
+        <w:t>Review the model and drawings for accuracy, consistency, and conflicts between building elements and disciplines.</w:t>
+      </w:r>
+    </w:p>
+    <w:p>
+      <w:pPr>
+        <w:rPr>
+          <w:sz w:val="24"/>
+          <w:szCs w:val="24"/>
+        </w:rPr>
+      </w:pPr>
+      <w:r>
+        <w:rPr>
+          <w:rStyle w:val="Strong"/>
+          <w:bCs w:val="0"/>
+          <w:sz w:val="24"/>
+          <w:szCs w:val="24"/>
+        </w:rPr>
+        <w:t>5. Documentation</w:t>
+      </w:r>
+    </w:p>
+    <w:p>
+      <w:r>
+        <w:t>Generate plans, sections, elevations, details, schedules, shop drawings, and other required documentation.</w:t>
+      </w:r>
+    </w:p>
+    <w:p>
+      <w:pPr>
+        <w:rPr>
+          <w:sz w:val="24"/>
+          <w:szCs w:val="24"/>
+        </w:rPr>
+      </w:pPr>
+      <w:r>
+        <w:rPr>
+          <w:rStyle w:val="Strong"/>
+          <w:bCs w:val="0"/>
+          <w:sz w:val="24"/>
+          <w:szCs w:val="24"/>
+        </w:rPr>
+        <w:t>6. Final Review &amp; Delivery</w:t>
+      </w:r>
+    </w:p>
+    <w:p>
+      <w:r>
+        <w:lastRenderedPageBreak/>
+        <w:t>Complete a quality review and deliver the final models and drawings in the required formats.</w:t>
+      </w:r>
+      <w:r>
+        <w:br/>
+      </w:r>
+      <w:r>
+        <w:br/>
+      </w:r>
+    </w:p>
+    <w:p>
+      <w:pPr>
+        <w:rPr>
+          <w:sz w:val="28"/>
+          <w:szCs w:val="28"/>
+        </w:rPr>
+      </w:pPr>
+      <w:r>
+        <w:rPr>
+          <w:rStyle w:val="Strong"/>
+          <w:bCs w:val="0"/>
+          <w:sz w:val="28"/>
+          <w:szCs w:val="28"/>
+        </w:rPr>
+        <w:t>Project Deliverables</w:t>
+      </w:r>
+    </w:p>
+    <w:p>
+      <w:r>
+        <w:t>Depending on the project scope, our BIM &amp; CAD package may include:</w:t>
+      </w:r>
+      <w:r>
+        <w:br/>
+      </w:r>
+    </w:p>
+    <w:p>
+      <w:pPr>
+        <w:pStyle w:val="ListParagraph"/>
+        <w:numPr>
+          <w:ilvl w:val="0"/>
+          <w:numId w:val="8"/>
+        </w:numPr>
+      </w:pPr>
+      <w:r>
+        <w:t xml:space="preserve">2D AutoCAD Drawings </w:t>
+      </w:r>
+    </w:p>
+    <w:p>
+      <w:pPr>
+        <w:pStyle w:val="ListParagraph"/>
+        <w:numPr>
+          <w:ilvl w:val="0"/>
+          <w:numId w:val="8"/>
+        </w:numPr>
+      </w:pPr>
+      <w:r>
+        <w:t xml:space="preserve">3D Revit Models </w:t>
+      </w:r>
+    </w:p>
+    <w:p>
+      <w:pPr>
+        <w:pStyle w:val="ListParagraph"/>
+        <w:numPr>
+          <w:ilvl w:val="0"/>
+          <w:numId w:val="8"/>
+        </w:numPr>
+      </w:pPr>
+      <w:r>
+        <w:t xml:space="preserve">Architectural BIM Models </w:t>
+      </w:r>
+    </w:p>
+    <w:p>
+      <w:pPr>
+        <w:pStyle w:val="ListParagraph"/>
+        <w:numPr>
+          <w:ilvl w:val="0"/>
+          <w:numId w:val="8"/>
+        </w:numPr>
+      </w:pPr>
+      <w:r>
+        <w:t xml:space="preserve">Structural BIM Models </w:t>
+      </w:r>
+    </w:p>
+    <w:p>
+      <w:pPr>
+        <w:pStyle w:val="ListParagraph"/>
+        <w:numPr>
+          <w:ilvl w:val="0"/>
+          <w:numId w:val="8"/>
+        </w:numPr>
+      </w:pPr>
+      <w:r>
+        <w:t xml:space="preserve">MEP BIM Models </w:t>
+      </w:r>
+    </w:p>
+    <w:p>
+      <w:pPr>
+        <w:pStyle w:val="ListParagraph"/>
+        <w:numPr>
+          <w:ilvl w:val="0"/>
+          <w:numId w:val="8"/>
+        </w:numPr>
+      </w:pPr>
+      <w:r>
+        <w:t xml:space="preserve">Construction Documentation </w:t>
+      </w:r>
+    </w:p>
+    <w:p>
+      <w:pPr>
+        <w:pStyle w:val="ListParagraph"/>
+        <w:numPr>
+          <w:ilvl w:val="0"/>
+          <w:numId w:val="8"/>
+        </w:numPr>
+      </w:pPr>
+      <w:r>
+        <w:t xml:space="preserve">Shop Drawings </w:t>
+      </w:r>
+    </w:p>
+    <w:p>
+      <w:pPr>
+        <w:pStyle w:val="ListParagraph"/>
+        <w:numPr>
+          <w:ilvl w:val="0"/>
+          <w:numId w:val="8"/>
+        </w:numPr>
+      </w:pPr>
+      <w:r>
+        <w:t xml:space="preserve">Coordination Drawings </w:t>
+      </w:r>
+    </w:p>
+    <w:p>
+      <w:pPr>
+        <w:pStyle w:val="ListParagraph"/>
+        <w:numPr>
+          <w:ilvl w:val="0"/>
+          <w:numId w:val="8"/>
+        </w:numPr>
+      </w:pPr>
+      <w:r>
+        <w:t xml:space="preserve">Clash Detection Reports </w:t>
+      </w:r>
+    </w:p>
+    <w:p>
+      <w:pPr>
+        <w:pStyle w:val="ListParagraph"/>
+        <w:numPr>
+          <w:ilvl w:val="0"/>
+          <w:numId w:val="8"/>
+        </w:numPr>
+      </w:pPr>
+      <w:r>
+        <w:t xml:space="preserve">Revit Families </w:t>
+      </w:r>
+    </w:p>
+    <w:p>
+      <w:pPr>
+        <w:pStyle w:val="ListParagraph"/>
+        <w:numPr>
+          <w:ilvl w:val="0"/>
+          <w:numId w:val="8"/>
+        </w:numPr>
+      </w:pPr>
+      <w:r>
+        <w:t xml:space="preserve">As-Built Drawings &amp; Models </w:t>
+      </w:r>
+    </w:p>
+    <w:p>
+      <w:pPr>
+        <w:pStyle w:val="ListParagraph"/>
+        <w:numPr>
+          <w:ilvl w:val="0"/>
+          <w:numId w:val="8"/>
+        </w:numPr>
+      </w:pPr>
+      <w:r>
+        <w:t xml:space="preserve">Quantity &amp; Model Data </w:t>
+      </w:r>
+    </w:p>
+    <w:p>
+      <w:pPr>
+        <w:pStyle w:val="ListParagraph"/>
+        <w:numPr>
+          <w:ilvl w:val="0"/>
+          <w:numId w:val="8"/>
+        </w:numPr>
+      </w:pPr>
+      <w:r>
+        <w:t xml:space="preserve">Drawing Sheets &amp; Schedules </w:t>
+      </w:r>
+    </w:p>
+    <w:p>
+      <w:pPr>
+        <w:pStyle w:val="ListParagraph"/>
+      </w:pPr>
       <w:bookmarkStart w:id="0" w:name="_GoBack"/>
       <w:bookmarkEnd w:id="0"/>
-    </w:p>
+      <w:r>
+        <w:br/>
+      </w:r>
+      <w:r>
+        <w:br/>
+      </w:r>
+    </w:p>
+    <w:p>
+      <w:pPr>
+        <w:rPr>
+          <w:sz w:val="28"/>
+          <w:szCs w:val="28"/>
+        </w:rPr>
+      </w:pPr>
+      <w:r>
+        <w:rPr>
+          <w:rStyle w:val="Strong"/>
+          <w:bCs w:val="0"/>
+          <w:sz w:val="28"/>
+          <w:szCs w:val="28"/>
+        </w:rPr>
+        <w:t>Software We Use</w:t>
+      </w:r>
+    </w:p>
+    <w:p>
+      <w:r>
+        <w:t>We use industry-standard BIM and CAD platforms to develop accurate, coordinated, and construction-ready documentation.</w:t>
+      </w:r>
+    </w:p>
+    <w:p>
+      <w:r>
+        <w:rPr>
+          <w:rStyle w:val="Strong"/>
+        </w:rPr>
+        <w:t>Autodesk Revit</w:t>
+      </w:r>
+      <w:r>
+        <w:t xml:space="preserve"> </w:t>
+      </w:r>
+    </w:p>
+    <w:p>
+      <w:r>
+        <w:rPr>
+          <w:rStyle w:val="Strong"/>
+        </w:rPr>
+        <w:t>AutoCAD</w:t>
+      </w:r>
+      <w:r>
+        <w:t xml:space="preserve"> </w:t>
+      </w:r>
+    </w:p>
+    <w:p>
+      <w:proofErr w:type="spellStart"/>
+      <w:r>
+        <w:rPr>
+          <w:rStyle w:val="Strong"/>
+        </w:rPr>
+        <w:t>Navisworks</w:t>
+      </w:r>
+      <w:proofErr w:type="spellEnd"/>
+      <w:r>
+        <w:rPr>
+          <w:rStyle w:val="Strong"/>
+        </w:rPr>
+        <w:t xml:space="preserve"> Manage</w:t>
+      </w:r>
+      <w:r>
+        <w:t xml:space="preserve"> </w:t>
+      </w:r>
+    </w:p>
+    <w:p>
+      <w:r>
+        <w:rPr>
+          <w:rStyle w:val="Strong"/>
+        </w:rPr>
+        <w:t>BIM 360 / Autodesk Construction Cloud</w:t>
+      </w:r>
+      <w:r>
+        <w:t xml:space="preserve"> </w:t>
+      </w:r>
+    </w:p>
+    <w:p>
+      <w:proofErr w:type="spellStart"/>
+      <w:r>
+        <w:rPr>
+          <w:rStyle w:val="Strong"/>
+        </w:rPr>
+        <w:t>BIMcollab</w:t>
+      </w:r>
+      <w:proofErr w:type="spellEnd"/>
+      <w:r>
+        <w:t xml:space="preserve"> </w:t>
+      </w:r>
+      <w:r>
+        <w:br/>
+      </w:r>
+      <w:r>
+        <w:br/>
+      </w:r>
+    </w:p>
+    <w:p>
+      <w:pPr>
+        <w:rPr>
+          <w:sz w:val="28"/>
+          <w:szCs w:val="28"/>
+        </w:rPr>
+      </w:pPr>
+      <w:r>
+        <w:rPr>
+          <w:rStyle w:val="Strong"/>
+          <w:bCs w:val="0"/>
+          <w:sz w:val="28"/>
+          <w:szCs w:val="28"/>
+        </w:rPr>
+        <w:t>FAQs</w:t>
+      </w:r>
+    </w:p>
+    <w:p>
+      <w:r>
+        <w:rPr>
+          <w:rStyle w:val="Strong"/>
+          <w:bCs w:val="0"/>
+        </w:rPr>
+        <w:t>What BIM services do you provide?</w:t>
+      </w:r>
+    </w:p>
+    <w:p>
+      <w:r>
+        <w:t>We provide BIM modeling, multidisciplinary coordination, clash detection, shop drawings, CAD drafting, Revit documentation, and as-built modeling.</w:t>
+      </w:r>
+    </w:p>
+    <w:p>
+      <w:r>
+        <w:rPr>
+          <w:rStyle w:val="Strong"/>
+          <w:bCs w:val="0"/>
+        </w:rPr>
+        <w:lastRenderedPageBreak/>
+        <w:t>Can you create a BIM model from 2D drawings?</w:t>
+      </w:r>
+    </w:p>
+    <w:p>
+      <w:r>
+        <w:t>Yes. We can develop 3D BIM models from architectural, structural, MEP, CAD, PDF, and other available project documentation.</w:t>
+      </w:r>
+    </w:p>
+    <w:p>
+      <w:r>
+        <w:rPr>
+          <w:rStyle w:val="Strong"/>
+          <w:bCs w:val="0"/>
+        </w:rPr>
+        <w:t>Do you provide clash detection?</w:t>
+      </w:r>
+    </w:p>
+    <w:p>
+      <w:r>
+        <w:t>Yes. We review coordinated models to identify potential conflicts between architectural, structural, mechanical, electrical, and plumbing elements.</w:t>
+      </w:r>
+    </w:p>
+    <w:p>
+      <w:r>
+        <w:rPr>
+          <w:rStyle w:val="Strong"/>
+          <w:bCs w:val="0"/>
+        </w:rPr>
+        <w:t>Can you update BIM models for as-built conditions?</w:t>
+      </w:r>
+    </w:p>
+    <w:p>
+      <w:r>
+        <w:t>Yes. We can update existing models based on field information, revisions, and construction changes to create accurate as-built documentation.</w:t>
+      </w:r>
+    </w:p>
+    <w:p>
+      <w:r>
+        <w:rPr>
+          <w:rStyle w:val="Strong"/>
+          <w:bCs w:val="0"/>
+        </w:rPr>
+        <w:t>Can you provide shop drawings from BIM models?</w:t>
+      </w:r>
+    </w:p>
+    <w:p>
+      <w:r>
+        <w:t>Yes. We can extract and develop detailed shop and coordination drawings from BIM models based on the project's requirements.</w:t>
+      </w:r>
+      <w:r>
+        <w:br/>
+      </w:r>
+      <w:r>
+        <w:br/>
+      </w:r>
+    </w:p>
+    <w:p>
+      <w:pPr>
+        <w:rPr>
+          <w:sz w:val="36"/>
+          <w:szCs w:val="36"/>
+        </w:rPr>
+      </w:pPr>
+      <w:r>
+        <w:br/>
+      </w:r>
+      <w:r>
+        <w:br/>
+      </w:r>
+      <w:r>
+        <w:br/>
+      </w:r>
+      <w:r>
+        <w:rPr>
+          <w:rStyle w:val="Strong"/>
+          <w:bCs w:val="0"/>
+          <w:sz w:val="36"/>
+          <w:szCs w:val="36"/>
+        </w:rPr>
+        <w:t>Rendering Services</w:t>
+      </w:r>
+    </w:p>
+    <w:p>
+      <w:pPr>
+        <w:pStyle w:val="NormalWeb"/>
+      </w:pPr>
+      <w:r>
+        <w:t>High-quality architectural renderings that bring designs to life, helping clients, developers, and project teams visualize the finished space before construction begins.</w:t>
+      </w:r>
+    </w:p>
+    <w:p>
+      <w:pPr>
+        <w:pStyle w:val="Heading2"/>
+      </w:pPr>
+      <w:r>
+        <w:rPr>
+          <w:rStyle w:val="Strong"/>
+          <w:b/>
+          <w:bCs/>
+        </w:rPr>
+        <w:t>Service Overview</w:t>
+      </w:r>
+    </w:p>
+    <w:p>
+      <w:pPr>
+        <w:pStyle w:val="NormalWeb"/>
+      </w:pPr>
+      <w:r>
+        <w:t>We create realistic 3D visuals that communicate the design, materials, finishes, lighting, and overall appearance of a project before it is built. Our renderings help clients review design concepts, make informed decisions, present projects to stakeholders, and market properties with confidence.</w:t>
+      </w:r>
+    </w:p>
+    <w:p>
+      <w:pPr>
+        <w:pStyle w:val="Heading2"/>
+      </w:pPr>
+      <w:r>
+        <w:rPr>
+          <w:rStyle w:val="Strong"/>
+          <w:b/>
+          <w:bCs/>
+        </w:rPr>
+        <w:t>Who We Work With</w:t>
+      </w:r>
+    </w:p>
+    <w:p>
+      <w:pPr>
+        <w:rPr>
+          <w:sz w:val="24"/>
+          <w:szCs w:val="24"/>
+        </w:rPr>
+      </w:pPr>
+      <w:r>
+        <w:rPr>
+          <w:rStyle w:val="Strong"/>
+          <w:bCs w:val="0"/>
+          <w:sz w:val="24"/>
+          <w:szCs w:val="24"/>
+        </w:rPr>
+        <w:t>Developers</w:t>
+      </w:r>
+    </w:p>
+    <w:p>
+      <w:pPr>
+        <w:pStyle w:val="NormalWeb"/>
+      </w:pPr>
+      <w:r>
+        <w:t>Showcase proposed developments through realistic visuals for presentations, approvals, leasing, and marketing.</w:t>
+      </w:r>
+    </w:p>
+    <w:p>
+      <w:pPr>
+        <w:rPr>
+          <w:sz w:val="24"/>
+          <w:szCs w:val="24"/>
+        </w:rPr>
+      </w:pPr>
+      <w:r>
+        <w:rPr>
+          <w:rStyle w:val="Strong"/>
+          <w:bCs w:val="0"/>
+          <w:sz w:val="24"/>
+          <w:szCs w:val="24"/>
+        </w:rPr>
+        <w:t>Architects &amp; Designers</w:t>
+      </w:r>
+    </w:p>
+    <w:p>
+      <w:pPr>
+        <w:pStyle w:val="NormalWeb"/>
+      </w:pPr>
+      <w:r>
+        <w:t>Present design concepts, materials, finishes, lighting, and spatial layouts clearly to clients.</w:t>
+      </w:r>
+    </w:p>
+    <w:p>
+      <w:pPr>
+        <w:rPr>
+          <w:sz w:val="24"/>
+          <w:szCs w:val="24"/>
+        </w:rPr>
+      </w:pPr>
+      <w:r>
+        <w:rPr>
+          <w:rStyle w:val="Strong"/>
+          <w:bCs w:val="0"/>
+          <w:sz w:val="24"/>
+          <w:szCs w:val="24"/>
+        </w:rPr>
+        <w:lastRenderedPageBreak/>
+        <w:t>Contractors</w:t>
+      </w:r>
+    </w:p>
+    <w:p>
+      <w:pPr>
+        <w:pStyle w:val="NormalWeb"/>
+      </w:pPr>
+      <w:r>
+        <w:t>Use visualizations to communicate design intent and help clients understand the finished project.</w:t>
+      </w:r>
+    </w:p>
+    <w:p>
+      <w:r>
+        <w:rPr>
+          <w:rStyle w:val="Strong"/>
+          <w:bCs w:val="0"/>
+        </w:rPr>
+        <w:t>Property Owners</w:t>
+      </w:r>
+    </w:p>
+    <w:p>
+      <w:pPr>
+        <w:pStyle w:val="NormalWeb"/>
+      </w:pPr>
+      <w:r>
+        <w:t>Visualize renovations, additions, interiors, and exterior improvements before construction begins.</w:t>
+      </w:r>
+    </w:p>
+    <w:p>
+      <w:pPr>
+        <w:pStyle w:val="Heading2"/>
+      </w:pPr>
+      <w:r>
+        <w:rPr>
+          <w:rStyle w:val="Strong"/>
+          <w:b/>
+          <w:bCs/>
+        </w:rPr>
+        <w:t>Our Rendering Process</w:t>
+      </w:r>
+    </w:p>
+    <w:p>
+      <w:pPr>
+        <w:pStyle w:val="NormalWeb"/>
+        <w:rPr>
+          <w:b/>
+        </w:rPr>
+      </w:pPr>
+      <w:r>
+        <w:rPr>
+          <w:rStyle w:val="Strong"/>
+          <w:b w:val="0"/>
+        </w:rPr>
+        <w:t>A simple six-step process for creating realistic and presentation-ready visualizations.</w:t>
+      </w:r>
+    </w:p>
+    <w:p>
+      <w:pPr>
+        <w:rPr>
+          <w:sz w:val="24"/>
+          <w:szCs w:val="24"/>
+        </w:rPr>
+      </w:pPr>
+      <w:r>
+        <w:rPr>
+          <w:rStyle w:val="Strong"/>
+          <w:bCs w:val="0"/>
+          <w:sz w:val="24"/>
+          <w:szCs w:val="24"/>
+        </w:rPr>
+        <w:t>1. Project Review</w:t>
+      </w:r>
+    </w:p>
+    <w:p>
+      <w:pPr>
+        <w:pStyle w:val="NormalWeb"/>
+      </w:pPr>
+      <w:r>
+        <w:t>Review drawings, 3D models, specifications, materials, and project requirements.</w:t>
+      </w:r>
+    </w:p>
+    <w:p>
+      <w:pPr>
+        <w:rPr>
+          <w:sz w:val="24"/>
+          <w:szCs w:val="24"/>
+        </w:rPr>
+      </w:pPr>
+      <w:r>
+        <w:rPr>
+          <w:rStyle w:val="Strong"/>
+          <w:bCs w:val="0"/>
+          <w:sz w:val="24"/>
+          <w:szCs w:val="24"/>
+        </w:rPr>
+        <w:t>2. 3D Development</w:t>
+      </w:r>
+    </w:p>
+    <w:p>
+      <w:pPr>
+        <w:pStyle w:val="NormalWeb"/>
+      </w:pPr>
+      <w:r>
+        <w:t>Build or refine the 3D model based on the approved design.</w:t>
+      </w:r>
+    </w:p>
+    <w:p>
+      <w:pPr>
+        <w:rPr>
+          <w:sz w:val="24"/>
+          <w:szCs w:val="24"/>
+        </w:rPr>
+      </w:pPr>
+      <w:r>
+        <w:rPr>
+          <w:rStyle w:val="Strong"/>
+          <w:bCs w:val="0"/>
+          <w:sz w:val="24"/>
+          <w:szCs w:val="24"/>
+        </w:rPr>
+        <w:t>3. Materials &amp; Finishes</w:t>
+      </w:r>
+    </w:p>
+    <w:p>
+      <w:pPr>
+        <w:pStyle w:val="NormalWeb"/>
+      </w:pPr>
+      <w:r>
+        <w:t>Apply realistic materials, textures, colors, fixtures, and finishes.</w:t>
+      </w:r>
+    </w:p>
+    <w:p>
+      <w:pPr>
+        <w:rPr>
+          <w:sz w:val="24"/>
+          <w:szCs w:val="24"/>
+        </w:rPr>
+      </w:pPr>
+      <w:r>
+        <w:rPr>
+          <w:rStyle w:val="Strong"/>
+          <w:bCs w:val="0"/>
+          <w:sz w:val="24"/>
+          <w:szCs w:val="24"/>
+        </w:rPr>
+        <w:t>4. Lighting &amp; Environment</w:t>
+      </w:r>
+    </w:p>
+    <w:p>
+      <w:pPr>
+        <w:pStyle w:val="NormalWeb"/>
+      </w:pPr>
+      <w:r>
+        <w:t>Develop interior or exterior lighting, landscaping, surroundings, and other visual elements.</w:t>
+      </w:r>
+    </w:p>
+    <w:p>
+      <w:pPr>
+        <w:rPr>
+          <w:sz w:val="24"/>
+          <w:szCs w:val="24"/>
+        </w:rPr>
+      </w:pPr>
+      <w:r>
+        <w:rPr>
+          <w:rStyle w:val="Strong"/>
+          <w:bCs w:val="0"/>
+          <w:sz w:val="24"/>
+          <w:szCs w:val="24"/>
+        </w:rPr>
+        <w:t>5. Preview &amp; Review</w:t>
+      </w:r>
+    </w:p>
+    <w:p>
+      <w:pPr>
+        <w:pStyle w:val="NormalWeb"/>
+      </w:pPr>
+      <w:r>
+        <w:t>Provide draft views for camera angles, materials, and overall presentation.</w:t>
+      </w:r>
+    </w:p>
+    <w:p>
+      <w:pPr>
+        <w:rPr>
+          <w:sz w:val="24"/>
+          <w:szCs w:val="24"/>
+        </w:rPr>
+      </w:pPr>
+      <w:r>
+        <w:rPr>
+          <w:rStyle w:val="Strong"/>
+          <w:bCs w:val="0"/>
+          <w:sz w:val="24"/>
+          <w:szCs w:val="24"/>
+        </w:rPr>
+        <w:t>6. Final Rendering</w:t>
+      </w:r>
+    </w:p>
+    <w:p>
+      <w:pPr>
+        <w:pStyle w:val="NormalWeb"/>
+      </w:pPr>
+      <w:r>
+        <w:t>Produce high-resolution final images and animations in the required format.</w:t>
+      </w:r>
+    </w:p>
+    <w:p>
+      <w:pPr>
+        <w:pStyle w:val="Heading2"/>
+      </w:pPr>
+      <w:r>
+        <w:rPr>
+          <w:rStyle w:val="Strong"/>
+          <w:b/>
+          <w:bCs/>
+        </w:rPr>
+        <w:t>Project Deliverables</w:t>
+      </w:r>
+    </w:p>
+    <w:p>
+      <w:pPr>
+        <w:pStyle w:val="NormalWeb"/>
+      </w:pPr>
+      <w:r>
+        <w:t>Depending on the project scope, our rendering package may include:</w:t>
+      </w:r>
+    </w:p>
+    <w:p>
+      <w:pPr>
+        <w:numPr>
+          <w:ilvl w:val="0"/>
+          <w:numId w:val="9"/>
+        </w:numPr>
+        <w:spacing w:before="100" w:beforeAutospacing="1" w:after="100" w:afterAutospacing="1" w:line="240" w:lineRule="auto"/>
+      </w:pPr>
+      <w:r>
+        <w:t xml:space="preserve">Exterior 3D Renderings </w:t>
+      </w:r>
+    </w:p>
+    <w:p>
+      <w:pPr>
+        <w:numPr>
+          <w:ilvl w:val="0"/>
+          <w:numId w:val="9"/>
+        </w:numPr>
+        <w:spacing w:before="100" w:beforeAutospacing="1" w:after="100" w:afterAutospacing="1" w:line="240" w:lineRule="auto"/>
+      </w:pPr>
+      <w:r>
+        <w:t xml:space="preserve">Interior 3D Renderings </w:t>
+      </w:r>
+    </w:p>
+    <w:p>
+      <w:pPr>
+        <w:numPr>
+          <w:ilvl w:val="0"/>
+          <w:numId w:val="9"/>
+        </w:numPr>
+        <w:spacing w:before="100" w:beforeAutospacing="1" w:after="100" w:afterAutospacing="1" w:line="240" w:lineRule="auto"/>
+      </w:pPr>
+      <w:r>
+        <w:t xml:space="preserve">Architectural Visualization </w:t>
+      </w:r>
+    </w:p>
+    <w:p>
+      <w:pPr>
+        <w:numPr>
+          <w:ilvl w:val="0"/>
+          <w:numId w:val="9"/>
+        </w:numPr>
+        <w:spacing w:before="100" w:beforeAutospacing="1" w:after="100" w:afterAutospacing="1" w:line="240" w:lineRule="auto"/>
+      </w:pPr>
+      <w:r>
+        <w:lastRenderedPageBreak/>
+        <w:t xml:space="preserve">3D Walkthroughs </w:t>
+      </w:r>
+    </w:p>
+    <w:p>
+      <w:pPr>
+        <w:numPr>
+          <w:ilvl w:val="0"/>
+          <w:numId w:val="9"/>
+        </w:numPr>
+        <w:spacing w:before="100" w:beforeAutospacing="1" w:after="100" w:afterAutospacing="1" w:line="240" w:lineRule="auto"/>
+      </w:pPr>
+      <w:r>
+        <w:t xml:space="preserve">Video Animations </w:t>
+      </w:r>
+    </w:p>
+    <w:p>
+      <w:pPr>
+        <w:numPr>
+          <w:ilvl w:val="0"/>
+          <w:numId w:val="9"/>
+        </w:numPr>
+        <w:spacing w:before="100" w:beforeAutospacing="1" w:after="100" w:afterAutospacing="1" w:line="240" w:lineRule="auto"/>
+      </w:pPr>
+      <w:r>
+        <w:t xml:space="preserve">Aerial / Site Renderings </w:t>
+      </w:r>
+    </w:p>
+    <w:p>
+      <w:pPr>
+        <w:numPr>
+          <w:ilvl w:val="0"/>
+          <w:numId w:val="9"/>
+        </w:numPr>
+        <w:spacing w:before="100" w:beforeAutospacing="1" w:after="100" w:afterAutospacing="1" w:line="240" w:lineRule="auto"/>
+      </w:pPr>
+      <w:r>
+        <w:t xml:space="preserve">360° Panoramic Views </w:t>
+      </w:r>
+    </w:p>
+    <w:p>
+      <w:pPr>
+        <w:numPr>
+          <w:ilvl w:val="0"/>
+          <w:numId w:val="9"/>
+        </w:numPr>
+        <w:spacing w:before="100" w:beforeAutospacing="1" w:after="100" w:afterAutospacing="1" w:line="240" w:lineRule="auto"/>
+      </w:pPr>
+      <w:r>
+        <w:t xml:space="preserve">Marketing Renderings </w:t>
+      </w:r>
+    </w:p>
+    <w:p>
+      <w:pPr>
+        <w:numPr>
+          <w:ilvl w:val="0"/>
+          <w:numId w:val="9"/>
+        </w:numPr>
+        <w:spacing w:before="100" w:beforeAutospacing="1" w:after="100" w:afterAutospacing="1" w:line="240" w:lineRule="auto"/>
+      </w:pPr>
+      <w:r>
+        <w:t xml:space="preserve">Conceptual 3D Visualization </w:t>
+      </w:r>
+    </w:p>
+    <w:p>
+      <w:pPr>
+        <w:pStyle w:val="Heading2"/>
+      </w:pPr>
+      <w:r>
+        <w:rPr>
+          <w:rStyle w:val="Strong"/>
+          <w:b/>
+          <w:bCs/>
+        </w:rPr>
+        <w:t>Software We Use</w:t>
+      </w:r>
+    </w:p>
+    <w:p>
+      <w:pPr>
+        <w:numPr>
+          <w:ilvl w:val="0"/>
+          <w:numId w:val="10"/>
+        </w:numPr>
+        <w:spacing w:before="100" w:beforeAutospacing="1" w:after="100" w:afterAutospacing="1" w:line="240" w:lineRule="auto"/>
+      </w:pPr>
+      <w:proofErr w:type="spellStart"/>
+      <w:r>
+        <w:t>Lumion</w:t>
+      </w:r>
+      <w:proofErr w:type="spellEnd"/>
+      <w:r>
+        <w:t xml:space="preserve"> </w:t>
+      </w:r>
+    </w:p>
+    <w:p>
+      <w:pPr>
+        <w:numPr>
+          <w:ilvl w:val="0"/>
+          <w:numId w:val="10"/>
+        </w:numPr>
+        <w:spacing w:before="100" w:beforeAutospacing="1" w:after="100" w:afterAutospacing="1" w:line="240" w:lineRule="auto"/>
+      </w:pPr>
+      <w:proofErr w:type="spellStart"/>
+      <w:r>
+        <w:t>Enscape</w:t>
+      </w:r>
+      <w:proofErr w:type="spellEnd"/>
+      <w:r>
+        <w:t xml:space="preserve"> </w:t>
+      </w:r>
+    </w:p>
+    <w:p>
+      <w:pPr>
+        <w:numPr>
+          <w:ilvl w:val="0"/>
+          <w:numId w:val="10"/>
+        </w:numPr>
+        <w:spacing w:before="100" w:beforeAutospacing="1" w:after="100" w:afterAutospacing="1" w:line="240" w:lineRule="auto"/>
+      </w:pPr>
+      <w:proofErr w:type="spellStart"/>
+      <w:r>
+        <w:t>SketchUp</w:t>
+      </w:r>
+      <w:proofErr w:type="spellEnd"/>
+      <w:r>
+        <w:t xml:space="preserve"> </w:t>
+      </w:r>
+    </w:p>
+    <w:p>
+      <w:pPr>
+        <w:numPr>
+          <w:ilvl w:val="0"/>
+          <w:numId w:val="10"/>
+        </w:numPr>
+        <w:spacing w:before="100" w:beforeAutospacing="1" w:after="100" w:afterAutospacing="1" w:line="240" w:lineRule="auto"/>
+      </w:pPr>
+      <w:r>
+        <w:t xml:space="preserve">3ds Max </w:t>
+      </w:r>
+    </w:p>
+    <w:p>
+      <w:pPr>
+        <w:numPr>
+          <w:ilvl w:val="0"/>
+          <w:numId w:val="10"/>
+        </w:numPr>
+        <w:spacing w:before="100" w:beforeAutospacing="1" w:after="100" w:afterAutospacing="1" w:line="240" w:lineRule="auto"/>
+      </w:pPr>
+      <w:r>
+        <w:t xml:space="preserve">V-Ray </w:t>
+      </w:r>
+    </w:p>
+    <w:p>
+      <w:pPr>
+        <w:numPr>
+          <w:ilvl w:val="0"/>
+          <w:numId w:val="10"/>
+        </w:numPr>
+        <w:spacing w:before="100" w:beforeAutospacing="1" w:after="100" w:afterAutospacing="1" w:line="240" w:lineRule="auto"/>
+      </w:pPr>
+      <w:r>
+        <w:t xml:space="preserve">Adobe Photoshop </w:t>
+      </w:r>
+    </w:p>
+    <w:p>
+      <w:pPr>
+        <w:numPr>
+          <w:ilvl w:val="0"/>
+          <w:numId w:val="10"/>
+        </w:numPr>
+        <w:spacing w:before="100" w:beforeAutospacing="1" w:after="100" w:afterAutospacing="1" w:line="240" w:lineRule="auto"/>
+      </w:pPr>
+      <w:r>
+        <w:t xml:space="preserve">Adobe Premiere Pro </w:t>
+      </w:r>
+    </w:p>
+    <w:p>
+      <w:pPr>
+        <w:pStyle w:val="Heading2"/>
+      </w:pPr>
+      <w:r>
+        <w:rPr>
+          <w:rStyle w:val="Strong"/>
+          <w:b/>
+          <w:bCs/>
+        </w:rPr>
+        <w:t>FAQs</w:t>
+      </w:r>
+    </w:p>
+    <w:p>
+      <w:pPr>
+        <w:rPr>
+          <w:sz w:val="24"/>
+          <w:szCs w:val="24"/>
+        </w:rPr>
+      </w:pPr>
+      <w:r>
+        <w:rPr>
+          <w:rStyle w:val="Strong"/>
+          <w:bCs w:val="0"/>
+          <w:sz w:val="24"/>
+          <w:szCs w:val="24"/>
+        </w:rPr>
+        <w:t>Can you create renderings from 2D drawings?</w:t>
+      </w:r>
+    </w:p>
+    <w:p>
+      <w:pPr>
+        <w:pStyle w:val="NormalWeb"/>
+      </w:pPr>
+      <w:r>
+        <w:t>Yes. We can develop 3D visualizations from floor plans, elevations, CAD drawings, PDFs, sketches, or existing 3D models.</w:t>
+      </w:r>
+    </w:p>
+    <w:p>
+      <w:pPr>
+        <w:rPr>
+          <w:sz w:val="24"/>
+          <w:szCs w:val="24"/>
+        </w:rPr>
+      </w:pPr>
+      <w:r>
+        <w:rPr>
+          <w:rStyle w:val="Strong"/>
+          <w:bCs w:val="0"/>
+          <w:sz w:val="24"/>
+          <w:szCs w:val="24"/>
+        </w:rPr>
+        <w:t>Do you provide both interior and exterior renderings?</w:t>
+      </w:r>
+    </w:p>
+    <w:p>
+      <w:pPr>
+        <w:pStyle w:val="NormalWeb"/>
+      </w:pPr>
+      <w:r>
+        <w:t>Yes. We create realistic visualizations for residential, commercial, and industrial interiors and exteriors.</w:t>
+      </w:r>
+    </w:p>
+    <w:p>
+      <w:pPr>
+        <w:rPr>
+          <w:sz w:val="24"/>
+          <w:szCs w:val="24"/>
+        </w:rPr>
+      </w:pPr>
+      <w:r>
+        <w:rPr>
+          <w:rStyle w:val="Strong"/>
+          <w:bCs w:val="0"/>
+          <w:sz w:val="24"/>
+          <w:szCs w:val="24"/>
+        </w:rPr>
+        <w:t>Can you match specific materials and finishes?</w:t>
+      </w:r>
+    </w:p>
+    <w:p>
+      <w:pPr>
+        <w:pStyle w:val="NormalWeb"/>
+      </w:pPr>
+      <w:r>
+        <w:t>Yes. We can incorporate selected materials, colors, finishes, fixtures, furniture, landscaping, and other design elements.</w:t>
+      </w:r>
+    </w:p>
+    <w:p>
+      <w:pPr>
+        <w:rPr>
+          <w:sz w:val="24"/>
+          <w:szCs w:val="24"/>
+        </w:rPr>
+      </w:pPr>
+      <w:r>
+        <w:rPr>
+          <w:rStyle w:val="Strong"/>
+          <w:bCs w:val="0"/>
+          <w:sz w:val="24"/>
+          <w:szCs w:val="24"/>
+        </w:rPr>
+        <w:t>Can you create walkthrough videos?</w:t>
+      </w:r>
+    </w:p>
+    <w:p>
+      <w:pPr>
+        <w:pStyle w:val="Heading2"/>
+      </w:pPr>
+      <w:r>
+        <w:rPr>
+          <w:b w:val="0"/>
+          <w:sz w:val="22"/>
+          <w:szCs w:val="22"/>
+        </w:rPr>
+        <w:t>Yes. We can produce animated walkthroughs that allow viewers to experience the proposed space from different perspectives.</w:t>
+      </w:r>
+      <w:r>
+        <w:br/>
+      </w:r>
+      <w:r>
+        <w:br/>
+      </w:r>
+      <w:r>
+        <w:br/>
+      </w:r>
+      <w:r>
+        <w:t>Estimation &amp; Quantity Takeoff Services</w:t>
+      </w:r>
+      <w:r>
+        <w:br/>
+      </w:r>
+      <w:r>
+        <w:br/>
+      </w:r>
+      <w:r>
+        <w:rPr>
+          <w:b w:val="0"/>
+          <w:sz w:val="24"/>
+          <w:szCs w:val="24"/>
+        </w:rPr>
+        <w:t xml:space="preserve">Detailed quantity takeoffs and construction estimates for residential, commercial, and industrial </w:t>
+      </w:r>
+      <w:r>
+        <w:rPr>
+          <w:b w:val="0"/>
+          <w:sz w:val="24"/>
+          <w:szCs w:val="24"/>
+        </w:rPr>
+        <w:lastRenderedPageBreak/>
+        <w:t>projects, providing organized material quantities and cost information to support accurate bidding and budgeting.</w:t>
+      </w:r>
+      <w:r>
+        <w:rPr>
+          <w:b w:val="0"/>
+          <w:sz w:val="24"/>
+          <w:szCs w:val="24"/>
+        </w:rPr>
+        <w:br/>
+      </w:r>
+      <w:r>
+        <w:br/>
+      </w:r>
+      <w:r>
+        <w:br/>
+      </w:r>
+      <w:r>
+        <w:rPr>
+          <w:rStyle w:val="Strong"/>
+          <w:b/>
+          <w:bCs/>
+        </w:rPr>
+        <w:t>Service Overview</w:t>
+      </w:r>
+    </w:p>
+    <w:p>
+      <w:pPr>
+        <w:pStyle w:val="NormalWeb"/>
+      </w:pPr>
+      <w:r>
+        <w:t>We provide detailed construction estimates and quantity takeoffs for residential, commercial, and industrial projects. Our estimating services help contractors, subcontractors, and developers understand project quantities, material requirements, and anticipated costs before work begins.</w:t>
+      </w:r>
+    </w:p>
+    <w:p>
+      <w:pPr>
+        <w:pStyle w:val="NormalWeb"/>
+      </w:pPr>
+      <w:r>
+        <w:t>We organize project information into clear, trade-specific estimates that make it easier to prepare competitive bids, evaluate project costs, and make informed decisions throughout the bidding and planning process.</w:t>
+      </w:r>
+    </w:p>
+    <w:p>
+      <w:pPr>
+        <w:pStyle w:val="Heading2"/>
+      </w:pPr>
+      <w:r>
+        <w:rPr>
+          <w:rStyle w:val="Strong"/>
+          <w:b/>
+          <w:bCs/>
+        </w:rPr>
+        <w:t>Who Needs Estimation &amp; Takeoff Services?</w:t>
+      </w:r>
+    </w:p>
+    <w:p>
+      <w:r>
+        <w:rPr>
+          <w:rStyle w:val="Strong"/>
+          <w:bCs w:val="0"/>
+        </w:rPr>
+        <w:t>General Contractors</w:t>
+      </w:r>
+    </w:p>
+    <w:p>
+      <w:pPr>
+        <w:pStyle w:val="NormalWeb"/>
+      </w:pPr>
+      <w:r>
+        <w:t>Need reliable quantity and cost information to prepare competitive bids and evaluate project profitability.</w:t>
+      </w:r>
+    </w:p>
+    <w:p>
+      <w:r>
+        <w:rPr>
+          <w:rStyle w:val="Strong"/>
+          <w:bCs w:val="0"/>
+        </w:rPr>
+        <w:t>Subcontractors</w:t>
+      </w:r>
+    </w:p>
+    <w:p>
+      <w:pPr>
+        <w:pStyle w:val="NormalWeb"/>
+      </w:pPr>
+      <w:r>
+        <w:t>Require detailed takeoffs for specific trades such as concrete, framing, drywall, roofing, painting, electrical, plumbing, and HVAC.</w:t>
+      </w:r>
+    </w:p>
+    <w:p>
+      <w:r>
+        <w:rPr>
+          <w:rStyle w:val="Strong"/>
+          <w:bCs w:val="0"/>
+        </w:rPr>
+        <w:t>Developers</w:t>
+      </w:r>
+    </w:p>
+    <w:p>
+      <w:pPr>
+        <w:pStyle w:val="NormalWeb"/>
+      </w:pPr>
+      <w:r>
+        <w:t xml:space="preserve">Need project cost information and quantity data to evaluate budgets, feasibility, and construction </w:t>
+      </w:r>
+      <w:proofErr w:type="gramStart"/>
+      <w:r>
+        <w:t>requirements.</w:t>
+      </w:r>
+      <w:proofErr w:type="gramEnd"/>
+    </w:p>
+    <w:p>
+      <w:r>
+        <w:rPr>
+          <w:rStyle w:val="Strong"/>
+          <w:bCs w:val="0"/>
+        </w:rPr>
+        <w:t>Builders &amp; Property Owners</w:t>
+      </w:r>
+    </w:p>
+    <w:p>
+      <w:pPr>
+        <w:pStyle w:val="NormalWeb"/>
+      </w:pPr>
+      <w:r>
+        <w:t>Need clear estimates to understand material quantities and projected construction costs before starting a project.</w:t>
+      </w:r>
+    </w:p>
+    <w:p>
+      <w:pPr>
+        <w:pStyle w:val="Heading2"/>
+      </w:pPr>
+      <w:r>
+        <w:rPr>
+          <w:rStyle w:val="Strong"/>
+          <w:b/>
+          <w:bCs/>
+        </w:rPr>
+        <w:t>Our Estimating Process</w:t>
+      </w:r>
+    </w:p>
+    <w:p>
+      <w:pPr>
+        <w:pStyle w:val="NormalWeb"/>
+      </w:pPr>
+      <w:r>
+        <w:rPr>
+          <w:rStyle w:val="Strong"/>
+        </w:rPr>
+        <w:t>A simple four-step process for organized and reliable project estimates.</w:t>
+      </w:r>
+    </w:p>
+    <w:p>
+      <w:r>
+        <w:rPr>
+          <w:rStyle w:val="Strong"/>
+          <w:bCs w:val="0"/>
+        </w:rPr>
+        <w:t>1. Plan Review</w:t>
+      </w:r>
+    </w:p>
+    <w:p>
+      <w:pPr>
+        <w:pStyle w:val="NormalWeb"/>
+      </w:pPr>
+      <w:r>
+        <w:lastRenderedPageBreak/>
+        <w:t>Review drawings, specifications, schedules, addenda, and project requirements to establish the estimating scope.</w:t>
+      </w:r>
+    </w:p>
+    <w:p>
+      <w:r>
+        <w:rPr>
+          <w:rStyle w:val="Strong"/>
+          <w:bCs w:val="0"/>
+        </w:rPr>
+        <w:t>2. Quantity Takeoff</w:t>
+      </w:r>
+    </w:p>
+    <w:p>
+      <w:pPr>
+        <w:pStyle w:val="NormalWeb"/>
+      </w:pPr>
+      <w:r>
+        <w:t>Measure and quantify the required materials, labor items, and construction components from the project documents.</w:t>
+      </w:r>
+    </w:p>
+    <w:p>
+      <w:r>
+        <w:rPr>
+          <w:rStyle w:val="Strong"/>
+          <w:bCs w:val="0"/>
+        </w:rPr>
+        <w:t>3. Cost Estimation</w:t>
+      </w:r>
+    </w:p>
+    <w:p>
+      <w:pPr>
+        <w:pStyle w:val="NormalWeb"/>
+      </w:pPr>
+      <w:r>
+        <w:t>Organize quantities and apply applicable unit costs, labor rates, and pricing information to develop the estimate.</w:t>
+      </w:r>
+    </w:p>
+    <w:p>
+      <w:r>
+        <w:rPr>
+          <w:rStyle w:val="Strong"/>
+          <w:bCs w:val="0"/>
+        </w:rPr>
+        <w:t>4. Review &amp; Delivery</w:t>
+      </w:r>
+    </w:p>
+    <w:p>
+      <w:pPr>
+        <w:pStyle w:val="NormalWeb"/>
+      </w:pPr>
+      <w:r>
+        <w:t>Check quantities and calculations, organize the results, and deliver the completed estimate in a clear, easy-to-review format.</w:t>
+      </w:r>
+    </w:p>
+    <w:p>
+      <w:pPr>
+        <w:pStyle w:val="NormalWeb"/>
+      </w:pPr>
+    </w:p>
+    <w:p>
+      <w:pPr>
+        <w:pStyle w:val="Heading2"/>
+      </w:pPr>
+      <w:r>
+        <w:rPr>
+          <w:rStyle w:val="Strong"/>
+          <w:b/>
+          <w:bCs/>
+        </w:rPr>
+        <w:t>Takeoff Deliverables</w:t>
+      </w:r>
+    </w:p>
+    <w:p>
+      <w:pPr>
+        <w:pStyle w:val="NormalWeb"/>
+      </w:pPr>
+      <w:r>
+        <w:br/>
+        <w:t>Our takeoff services provide clear, organized documentation to support accurate bidding and project planning:</w:t>
+      </w:r>
+    </w:p>
+    <w:p>
+      <w:pPr>
+        <w:numPr>
+          <w:ilvl w:val="0"/>
+          <w:numId w:val="11"/>
+        </w:numPr>
+        <w:spacing w:before="100" w:beforeAutospacing="1" w:after="100" w:afterAutospacing="1" w:line="240" w:lineRule="auto"/>
+      </w:pPr>
+      <w:r>
+        <w:rPr>
+          <w:rStyle w:val="Strong"/>
+        </w:rPr>
+        <w:t>Detailed Material &amp; Quantity Lists</w:t>
+      </w:r>
+      <w:r>
+        <w:t xml:space="preserve"> </w:t>
+      </w:r>
+    </w:p>
+    <w:p>
+      <w:pPr>
+        <w:numPr>
+          <w:ilvl w:val="0"/>
+          <w:numId w:val="11"/>
+        </w:numPr>
+        <w:spacing w:before="100" w:beforeAutospacing="1" w:after="100" w:afterAutospacing="1" w:line="240" w:lineRule="auto"/>
+      </w:pPr>
+      <w:r>
+        <w:rPr>
+          <w:rStyle w:val="Strong"/>
+        </w:rPr>
+        <w:t>Excel-Based Takeoff Spreadsheets</w:t>
+      </w:r>
+      <w:r>
+        <w:t xml:space="preserve"> </w:t>
+      </w:r>
+    </w:p>
+    <w:p>
+      <w:pPr>
+        <w:numPr>
+          <w:ilvl w:val="0"/>
+          <w:numId w:val="11"/>
+        </w:numPr>
+        <w:spacing w:before="100" w:beforeAutospacing="1" w:after="100" w:afterAutospacing="1" w:line="240" w:lineRule="auto"/>
+      </w:pPr>
+      <w:r>
+        <w:rPr>
+          <w:rStyle w:val="Strong"/>
+        </w:rPr>
+        <w:t>Color-Coded Drawing Markups</w:t>
+      </w:r>
+      <w:r>
+        <w:t xml:space="preserve"> </w:t>
+      </w:r>
+    </w:p>
+    <w:p>
+      <w:pPr>
+        <w:numPr>
+          <w:ilvl w:val="0"/>
+          <w:numId w:val="11"/>
+        </w:numPr>
+        <w:spacing w:before="100" w:beforeAutospacing="1" w:after="100" w:afterAutospacing="1" w:line="240" w:lineRule="auto"/>
+      </w:pPr>
+      <w:r>
+        <w:rPr>
+          <w:rStyle w:val="Strong"/>
+        </w:rPr>
+        <w:t>CSI Division-Based Quantity Breakdowns</w:t>
+      </w:r>
+      <w:r>
+        <w:t xml:space="preserve"> </w:t>
+      </w:r>
+    </w:p>
+    <w:p>
+      <w:pPr>
+        <w:numPr>
+          <w:ilvl w:val="0"/>
+          <w:numId w:val="11"/>
+        </w:numPr>
+        <w:spacing w:before="100" w:beforeAutospacing="1" w:after="100" w:afterAutospacing="1" w:line="240" w:lineRule="auto"/>
+      </w:pPr>
+      <w:r>
+        <w:rPr>
+          <w:rStyle w:val="Strong"/>
+        </w:rPr>
+        <w:t>Slab, Framing &amp; Structural Quantity Reports</w:t>
+      </w:r>
+      <w:r>
+        <w:rPr>
+          <w:rStyle w:val="Strong"/>
+        </w:rPr>
+        <w:br/>
+      </w:r>
+      <w:r>
+        <w:rPr>
+          <w:rStyle w:val="Strong"/>
+        </w:rPr>
+        <w:br/>
+      </w:r>
+    </w:p>
+    <w:p>
+      <w:pPr>
+        <w:pStyle w:val="Heading2"/>
+      </w:pPr>
+      <w:r>
+        <w:rPr>
+          <w:rStyle w:val="Strong"/>
+          <w:b/>
+          <w:bCs/>
+        </w:rPr>
+        <w:t>Software We Use</w:t>
+      </w:r>
+    </w:p>
+    <w:p>
+      <w:pPr>
+        <w:pStyle w:val="NormalWeb"/>
+      </w:pPr>
+      <w:r>
+        <w:t>We use industry-standard estimating and takeoff software to measure, organize, and present project quantities efficiently.</w:t>
+      </w:r>
+    </w:p>
+    <w:p>
+      <w:pPr>
+        <w:numPr>
+          <w:ilvl w:val="0"/>
+          <w:numId w:val="12"/>
+        </w:numPr>
+        <w:spacing w:before="100" w:beforeAutospacing="1" w:after="100" w:afterAutospacing="1" w:line="240" w:lineRule="auto"/>
+      </w:pPr>
+      <w:proofErr w:type="spellStart"/>
+      <w:r>
+        <w:rPr>
+          <w:rStyle w:val="Strong"/>
+        </w:rPr>
+        <w:t>Bluebeam</w:t>
+      </w:r>
+      <w:proofErr w:type="spellEnd"/>
+      <w:r>
+        <w:rPr>
+          <w:rStyle w:val="Strong"/>
+        </w:rPr>
+        <w:t xml:space="preserve"> </w:t>
+      </w:r>
+      <w:proofErr w:type="spellStart"/>
+      <w:r>
+        <w:rPr>
+          <w:rStyle w:val="Strong"/>
+        </w:rPr>
+        <w:t>Revu</w:t>
+      </w:r>
+      <w:proofErr w:type="spellEnd"/>
+      <w:r>
+        <w:t xml:space="preserve"> </w:t>
+      </w:r>
+    </w:p>
+    <w:p>
+      <w:pPr>
+        <w:numPr>
+          <w:ilvl w:val="0"/>
+          <w:numId w:val="12"/>
+        </w:numPr>
+        <w:spacing w:before="100" w:beforeAutospacing="1" w:after="100" w:afterAutospacing="1" w:line="240" w:lineRule="auto"/>
+      </w:pPr>
+      <w:proofErr w:type="spellStart"/>
+      <w:r>
+        <w:rPr>
+          <w:rStyle w:val="Strong"/>
+        </w:rPr>
+        <w:t>PlanSwift</w:t>
+      </w:r>
+      <w:proofErr w:type="spellEnd"/>
+      <w:r>
+        <w:t xml:space="preserve"> </w:t>
+      </w:r>
+    </w:p>
+    <w:p>
+      <w:pPr>
+        <w:numPr>
+          <w:ilvl w:val="0"/>
+          <w:numId w:val="12"/>
+        </w:numPr>
+        <w:spacing w:before="100" w:beforeAutospacing="1" w:after="100" w:afterAutospacing="1" w:line="240" w:lineRule="auto"/>
+      </w:pPr>
+      <w:r>
+        <w:rPr>
+          <w:rStyle w:val="Strong"/>
+        </w:rPr>
+        <w:t>On-Screen Takeoff</w:t>
+      </w:r>
+      <w:r>
+        <w:t xml:space="preserve"> </w:t>
+      </w:r>
+    </w:p>
+    <w:p>
+      <w:pPr>
+        <w:numPr>
+          <w:ilvl w:val="0"/>
+          <w:numId w:val="12"/>
+        </w:numPr>
+        <w:spacing w:before="100" w:beforeAutospacing="1" w:after="100" w:afterAutospacing="1" w:line="240" w:lineRule="auto"/>
+      </w:pPr>
+      <w:r>
+        <w:rPr>
+          <w:rStyle w:val="Strong"/>
+        </w:rPr>
+        <w:t>Microsoft Excel</w:t>
+      </w:r>
+    </w:p>
+    <w:p/>
     <w:sectPr>
       <w:pgSz w:w="12240" w:h="15840"/>
       <w:pgMar w:top="1440" w:right="1440" w:bottom="1440" w:left="1440" w:header="720" w:footer="720" w:gutter="0"/>
@@ -2375,6 +4369,155 @@
 <file path=word/numbering.xml><?xml version="1.0" encoding="utf-8"?>
 <w:numbering xmlns:wpc="http://schemas.microsoft.com/office/word/2010/wordprocessingCanvas" xmlns:mc="http://schemas.openxmlformats.org/markup-compatibility/2006" xmlns:o="urn:schemas-microsoft-com:office:office" xmlns:r="http://schemas.openxmlformats.org/officeDocument/2006/relationships" xmlns:m="http://schemas.openxmlformats.org/officeDocument/2006/math" xmlns:v="urn:schemas-microsoft-com:vml" xmlns:wp14="http://schemas.microsoft.com/office/word/2010/wordprocessingDrawing" xmlns:wp="http://schemas.openxmlformats.org/drawingml/2006/wordprocessingDrawing" xmlns:w10="urn:schemas-microsoft-com:office:word" xmlns:w="http://schemas.openxmlformats.org/wordprocessingml/2006/main" xmlns:w14="http://schemas.microsoft.com/office/word/2010/wordml" xmlns:w15="http://schemas.microsoft.com/office/word/2012/wordml" xmlns:wpg="http://schemas.microsoft.com/office/word/2010/wordprocessingGroup" xmlns:wpi="http://schemas.microsoft.com/office/word/2010/wordprocessingInk" xmlns:wne="http://schemas.microsoft.com/office/word/2006/wordml" xmlns:wps="http://schemas.microsoft.com/office/word/2010/wordprocessingShape" mc:Ignorable="w14 w15 wp14">
   <w:abstractNum w:abstractNumId="0">
+    <w:nsid w:val="016F1E57"/>
+    <w:multiLevelType w:val="multilevel"/>
+    <w:tmpl w:val="68EC899C"/>
+    <w:lvl w:ilvl="0">
+      <w:start w:val="1"/>
+      <w:numFmt w:val="bullet"/>
+      <w:lvlText w:val=""/>
+      <w:lvlJc w:val="left"/>
+      <w:pPr>
+        <w:tabs>
+          <w:tab w:val="num" w:pos="720"/>
+        </w:tabs>
+        <w:ind w:left="720" w:hanging="360"/>
+      </w:pPr>
+      <w:rPr>
+        <w:rFonts w:ascii="Symbol" w:hAnsi="Symbol" w:hint="default"/>
+        <w:sz w:val="20"/>
+      </w:rPr>
+    </w:lvl>
+    <w:lvl w:ilvl="1" w:tentative="1">
+      <w:start w:val="1"/>
+      <w:numFmt w:val="bullet"/>
+      <w:lvlText w:val="o"/>
+      <w:lvlJc w:val="left"/>
+      <w:pPr>
+        <w:tabs>
+          <w:tab w:val="num" w:pos="1440"/>
+        </w:tabs>
+        <w:ind w:left="1440" w:hanging="360"/>
+      </w:pPr>
+      <w:rPr>
+        <w:rFonts w:ascii="Courier New" w:hAnsi="Courier New" w:hint="default"/>
+        <w:sz w:val="20"/>
+      </w:rPr>
+    </w:lvl>
+    <w:lvl w:ilvl="2" w:tentative="1">
+      <w:start w:val="1"/>
+      <w:numFmt w:val="bullet"/>
+      <w:lvlText w:val=""/>
+      <w:lvlJc w:val="left"/>
+      <w:pPr>
+        <w:tabs>
+          <w:tab w:val="num" w:pos="2160"/>
+        </w:tabs>
+        <w:ind w:left="2160" w:hanging="360"/>
+      </w:pPr>
+      <w:rPr>
+        <w:rFonts w:ascii="Wingdings" w:hAnsi="Wingdings" w:hint="default"/>
+        <w:sz w:val="20"/>
+      </w:rPr>
+    </w:lvl>
+    <w:lvl w:ilvl="3" w:tentative="1">
+      <w:start w:val="1"/>
+      <w:numFmt w:val="bullet"/>
+      <w:lvlText w:val=""/>
+      <w:lvlJc w:val="left"/>
+      <w:pPr>
+        <w:tabs>
+          <w:tab w:val="num" w:pos="2880"/>
+        </w:tabs>
+        <w:ind w:left="2880" w:hanging="360"/>
+      </w:pPr>
+      <w:rPr>
+        <w:rFonts w:ascii="Wingdings" w:hAnsi="Wingdings" w:hint="default"/>
+        <w:sz w:val="20"/>
+      </w:rPr>
+    </w:lvl>
+    <w:lvl w:ilvl="4" w:tentative="1">
+      <w:start w:val="1"/>
+      <w:numFmt w:val="bullet"/>
+      <w:lvlText w:val=""/>
+      <w:lvlJc w:val="left"/>
+      <w:pPr>
+        <w:tabs>
+          <w:tab w:val="num" w:pos="3600"/>
+        </w:tabs>
+        <w:ind w:left="3600" w:hanging="360"/>
+      </w:pPr>
+      <w:rPr>
+        <w:rFonts w:ascii="Wingdings" w:hAnsi="Wingdings" w:hint="default"/>
+        <w:sz w:val="20"/>
+      </w:rPr>
+    </w:lvl>
+    <w:lvl w:ilvl="5" w:tentative="1">
+      <w:start w:val="1"/>
+      <w:numFmt w:val="bullet"/>
+      <w:lvlText w:val=""/>
+      <w:lvlJc w:val="left"/>
+      <w:pPr>
+        <w:tabs>
+          <w:tab w:val="num" w:pos="4320"/>
+        </w:tabs>
+        <w:ind w:left="4320" w:hanging="360"/>
+      </w:pPr>
+      <w:rPr>
+        <w:rFonts w:ascii="Wingdings" w:hAnsi="Wingdings" w:hint="default"/>
+        <w:sz w:val="20"/>
+      </w:rPr>
+    </w:lvl>
+    <w:lvl w:ilvl="6" w:tentative="1">
+      <w:start w:val="1"/>
+      <w:numFmt w:val="bullet"/>
+      <w:lvlText w:val=""/>
+      <w:lvlJc w:val="left"/>
+      <w:pPr>
+        <w:tabs>
+          <w:tab w:val="num" w:pos="5040"/>
+        </w:tabs>
+        <w:ind w:left="5040" w:hanging="360"/>
+      </w:pPr>
+      <w:rPr>
+        <w:rFonts w:ascii="Wingdings" w:hAnsi="Wingdings" w:hint="default"/>
+        <w:sz w:val="20"/>
+      </w:rPr>
+    </w:lvl>
+    <w:lvl w:ilvl="7" w:tentative="1">
+      <w:start w:val="1"/>
+      <w:numFmt w:val="bullet"/>
+      <w:lvlText w:val=""/>
+      <w:lvlJc w:val="left"/>
+      <w:pPr>
+        <w:tabs>
+          <w:tab w:val="num" w:pos="5760"/>
+        </w:tabs>
+        <w:ind w:left="5760" w:hanging="360"/>
+      </w:pPr>
+      <w:rPr>
+        <w:rFonts w:ascii="Wingdings" w:hAnsi="Wingdings" w:hint="default"/>
+        <w:sz w:val="20"/>
+      </w:rPr>
+    </w:lvl>
+    <w:lvl w:ilvl="8" w:tentative="1">
+      <w:start w:val="1"/>
+      <w:numFmt w:val="bullet"/>
+      <w:lvlText w:val=""/>
+      <w:lvlJc w:val="left"/>
+      <w:pPr>
+        <w:tabs>
+          <w:tab w:val="num" w:pos="6480"/>
+        </w:tabs>
+        <w:ind w:left="6480" w:hanging="360"/>
+      </w:pPr>
+      <w:rPr>
+        <w:rFonts w:ascii="Wingdings" w:hAnsi="Wingdings" w:hint="default"/>
+        <w:sz w:val="20"/>
+      </w:rPr>
+    </w:lvl>
+  </w:abstractNum>
+  <w:abstractNum w:abstractNumId="1">
     <w:nsid w:val="19B57111"/>
     <w:multiLevelType w:val="multilevel"/>
     <w:tmpl w:val="EBD4E4C2"/>
@@ -2523,7 +4666,7 @@
       </w:rPr>
     </w:lvl>
   </w:abstractNum>
-  <w:abstractNum w:abstractNumId="1">
+  <w:abstractNum w:abstractNumId="2">
     <w:nsid w:val="1BEE2C9E"/>
     <w:multiLevelType w:val="multilevel"/>
     <w:tmpl w:val="D4A2EDA8"/>
@@ -2672,7 +4815,305 @@
       </w:rPr>
     </w:lvl>
   </w:abstractNum>
-  <w:abstractNum w:abstractNumId="2">
+  <w:abstractNum w:abstractNumId="3">
+    <w:nsid w:val="2841063F"/>
+    <w:multiLevelType w:val="multilevel"/>
+    <w:tmpl w:val="92F685FE"/>
+    <w:lvl w:ilvl="0">
+      <w:start w:val="1"/>
+      <w:numFmt w:val="bullet"/>
+      <w:lvlText w:val=""/>
+      <w:lvlJc w:val="left"/>
+      <w:pPr>
+        <w:tabs>
+          <w:tab w:val="num" w:pos="720"/>
+        </w:tabs>
+        <w:ind w:left="720" w:hanging="360"/>
+      </w:pPr>
+      <w:rPr>
+        <w:rFonts w:ascii="Symbol" w:hAnsi="Symbol" w:hint="default"/>
+        <w:sz w:val="20"/>
+      </w:rPr>
+    </w:lvl>
+    <w:lvl w:ilvl="1" w:tentative="1">
+      <w:start w:val="1"/>
+      <w:numFmt w:val="bullet"/>
+      <w:lvlText w:val="o"/>
+      <w:lvlJc w:val="left"/>
+      <w:pPr>
+        <w:tabs>
+          <w:tab w:val="num" w:pos="1440"/>
+        </w:tabs>
+        <w:ind w:left="1440" w:hanging="360"/>
+      </w:pPr>
+      <w:rPr>
+        <w:rFonts w:ascii="Courier New" w:hAnsi="Courier New" w:hint="default"/>
+        <w:sz w:val="20"/>
+      </w:rPr>
+    </w:lvl>
+    <w:lvl w:ilvl="2" w:tentative="1">
+      <w:start w:val="1"/>
+      <w:numFmt w:val="bullet"/>
+      <w:lvlText w:val=""/>
+      <w:lvlJc w:val="left"/>
+      <w:pPr>
+        <w:tabs>
+          <w:tab w:val="num" w:pos="2160"/>
+        </w:tabs>
+        <w:ind w:left="2160" w:hanging="360"/>
+      </w:pPr>
+      <w:rPr>
+        <w:rFonts w:ascii="Wingdings" w:hAnsi="Wingdings" w:hint="default"/>
+        <w:sz w:val="20"/>
+      </w:rPr>
+    </w:lvl>
+    <w:lvl w:ilvl="3" w:tentative="1">
+      <w:start w:val="1"/>
+      <w:numFmt w:val="bullet"/>
+      <w:lvlText w:val=""/>
+      <w:lvlJc w:val="left"/>
+      <w:pPr>
+        <w:tabs>
+          <w:tab w:val="num" w:pos="2880"/>
+        </w:tabs>
+        <w:ind w:left="2880" w:hanging="360"/>
+      </w:pPr>
+      <w:rPr>
+        <w:rFonts w:ascii="Wingdings" w:hAnsi="Wingdings" w:hint="default"/>
+        <w:sz w:val="20"/>
+      </w:rPr>
+    </w:lvl>
+    <w:lvl w:ilvl="4" w:tentative="1">
+      <w:start w:val="1"/>
+      <w:numFmt w:val="bullet"/>
+      <w:lvlText w:val=""/>
+      <w:lvlJc w:val="left"/>
+      <w:pPr>
+        <w:tabs>
+          <w:tab w:val="num" w:pos="3600"/>
+        </w:tabs>
+        <w:ind w:left="3600" w:hanging="360"/>
+      </w:pPr>
+      <w:rPr>
+        <w:rFonts w:ascii="Wingdings" w:hAnsi="Wingdings" w:hint="default"/>
+        <w:sz w:val="20"/>
+      </w:rPr>
+    </w:lvl>
+    <w:lvl w:ilvl="5" w:tentative="1">
+      <w:start w:val="1"/>
+      <w:numFmt w:val="bullet"/>
+      <w:lvlText w:val=""/>
+      <w:lvlJc w:val="left"/>
+      <w:pPr>
+        <w:tabs>
+          <w:tab w:val="num" w:pos="4320"/>
+        </w:tabs>
+        <w:ind w:left="4320" w:hanging="360"/>
+      </w:pPr>
+      <w:rPr>
+        <w:rFonts w:ascii="Wingdings" w:hAnsi="Wingdings" w:hint="default"/>
+        <w:sz w:val="20"/>
+      </w:rPr>
+    </w:lvl>
+    <w:lvl w:ilvl="6" w:tentative="1">
+      <w:start w:val="1"/>
+      <w:numFmt w:val="bullet"/>
+      <w:lvlText w:val=""/>
+      <w:lvlJc w:val="left"/>
+      <w:pPr>
+        <w:tabs>
+          <w:tab w:val="num" w:pos="5040"/>
+        </w:tabs>
+        <w:ind w:left="5040" w:hanging="360"/>
+      </w:pPr>
+      <w:rPr>
+        <w:rFonts w:ascii="Wingdings" w:hAnsi="Wingdings" w:hint="default"/>
+        <w:sz w:val="20"/>
+      </w:rPr>
+    </w:lvl>
+    <w:lvl w:ilvl="7" w:tentative="1">
+      <w:start w:val="1"/>
+      <w:numFmt w:val="bullet"/>
+      <w:lvlText w:val=""/>
+      <w:lvlJc w:val="left"/>
+      <w:pPr>
+        <w:tabs>
+          <w:tab w:val="num" w:pos="5760"/>
+        </w:tabs>
+        <w:ind w:left="5760" w:hanging="360"/>
+      </w:pPr>
+      <w:rPr>
+        <w:rFonts w:ascii="Wingdings" w:hAnsi="Wingdings" w:hint="default"/>
+        <w:sz w:val="20"/>
+      </w:rPr>
+    </w:lvl>
+    <w:lvl w:ilvl="8" w:tentative="1">
+      <w:start w:val="1"/>
+      <w:numFmt w:val="bullet"/>
+      <w:lvlText w:val=""/>
+      <w:lvlJc w:val="left"/>
+      <w:pPr>
+        <w:tabs>
+          <w:tab w:val="num" w:pos="6480"/>
+        </w:tabs>
+        <w:ind w:left="6480" w:hanging="360"/>
+      </w:pPr>
+      <w:rPr>
+        <w:rFonts w:ascii="Wingdings" w:hAnsi="Wingdings" w:hint="default"/>
+        <w:sz w:val="20"/>
+      </w:rPr>
+    </w:lvl>
+  </w:abstractNum>
+  <w:abstractNum w:abstractNumId="4">
+    <w:nsid w:val="31E9640D"/>
+    <w:multiLevelType w:val="multilevel"/>
+    <w:tmpl w:val="0D40D1BA"/>
+    <w:lvl w:ilvl="0">
+      <w:start w:val="1"/>
+      <w:numFmt w:val="bullet"/>
+      <w:lvlText w:val=""/>
+      <w:lvlJc w:val="left"/>
+      <w:pPr>
+        <w:tabs>
+          <w:tab w:val="num" w:pos="720"/>
+        </w:tabs>
+        <w:ind w:left="720" w:hanging="360"/>
+      </w:pPr>
+      <w:rPr>
+        <w:rFonts w:ascii="Symbol" w:hAnsi="Symbol" w:hint="default"/>
+        <w:sz w:val="20"/>
+      </w:rPr>
+    </w:lvl>
+    <w:lvl w:ilvl="1" w:tentative="1">
+      <w:start w:val="1"/>
+      <w:numFmt w:val="bullet"/>
+      <w:lvlText w:val="o"/>
+      <w:lvlJc w:val="left"/>
+      <w:pPr>
+        <w:tabs>
+          <w:tab w:val="num" w:pos="1440"/>
+        </w:tabs>
+        <w:ind w:left="1440" w:hanging="360"/>
+      </w:pPr>
+      <w:rPr>
+        <w:rFonts w:ascii="Courier New" w:hAnsi="Courier New" w:hint="default"/>
+        <w:sz w:val="20"/>
+      </w:rPr>
+    </w:lvl>
+    <w:lvl w:ilvl="2" w:tentative="1">
+      <w:start w:val="1"/>
+      <w:numFmt w:val="bullet"/>
+      <w:lvlText w:val=""/>
+      <w:lvlJc w:val="left"/>
+      <w:pPr>
+        <w:tabs>
+          <w:tab w:val="num" w:pos="2160"/>
+        </w:tabs>
+        <w:ind w:left="2160" w:hanging="360"/>
+      </w:pPr>
+      <w:rPr>
+        <w:rFonts w:ascii="Wingdings" w:hAnsi="Wingdings" w:hint="default"/>
+        <w:sz w:val="20"/>
+      </w:rPr>
+    </w:lvl>
+    <w:lvl w:ilvl="3" w:tentative="1">
+      <w:start w:val="1"/>
+      <w:numFmt w:val="bullet"/>
+      <w:lvlText w:val=""/>
+      <w:lvlJc w:val="left"/>
+      <w:pPr>
+        <w:tabs>
+          <w:tab w:val="num" w:pos="2880"/>
+        </w:tabs>
+        <w:ind w:left="2880" w:hanging="360"/>
+      </w:pPr>
+      <w:rPr>
+        <w:rFonts w:ascii="Wingdings" w:hAnsi="Wingdings" w:hint="default"/>
+        <w:sz w:val="20"/>
+      </w:rPr>
+    </w:lvl>
+    <w:lvl w:ilvl="4" w:tentative="1">
+      <w:start w:val="1"/>
+      <w:numFmt w:val="bullet"/>
+      <w:lvlText w:val=""/>
+      <w:lvlJc w:val="left"/>
+      <w:pPr>
+        <w:tabs>
+          <w:tab w:val="num" w:pos="3600"/>
+        </w:tabs>
+        <w:ind w:left="3600" w:hanging="360"/>
+      </w:pPr>
+      <w:rPr>
+        <w:rFonts w:ascii="Wingdings" w:hAnsi="Wingdings" w:hint="default"/>
+        <w:sz w:val="20"/>
+      </w:rPr>
+    </w:lvl>
+    <w:lvl w:ilvl="5" w:tentative="1">
+      <w:start w:val="1"/>
+      <w:numFmt w:val="bullet"/>
+      <w:lvlText w:val=""/>
+      <w:lvlJc w:val="left"/>
+      <w:pPr>
+        <w:tabs>
+          <w:tab w:val="num" w:pos="4320"/>
+        </w:tabs>
+        <w:ind w:left="4320" w:hanging="360"/>
+      </w:pPr>
+      <w:rPr>
+        <w:rFonts w:ascii="Wingdings" w:hAnsi="Wingdings" w:hint="default"/>
+        <w:sz w:val="20"/>
+      </w:rPr>
+    </w:lvl>
+    <w:lvl w:ilvl="6" w:tentative="1">
+      <w:start w:val="1"/>
+      <w:numFmt w:val="bullet"/>
+      <w:lvlText w:val=""/>
+      <w:lvlJc w:val="left"/>
+      <w:pPr>
+        <w:tabs>
+          <w:tab w:val="num" w:pos="5040"/>
+        </w:tabs>
+        <w:ind w:left="5040" w:hanging="360"/>
+      </w:pPr>
+      <w:rPr>
+        <w:rFonts w:ascii="Wingdings" w:hAnsi="Wingdings" w:hint="default"/>
+        <w:sz w:val="20"/>
+      </w:rPr>
+    </w:lvl>
+    <w:lvl w:ilvl="7" w:tentative="1">
+      <w:start w:val="1"/>
+      <w:numFmt w:val="bullet"/>
+      <w:lvlText w:val=""/>
+      <w:lvlJc w:val="left"/>
+      <w:pPr>
+        <w:tabs>
+          <w:tab w:val="num" w:pos="5760"/>
+        </w:tabs>
+        <w:ind w:left="5760" w:hanging="360"/>
+      </w:pPr>
+      <w:rPr>
+        <w:rFonts w:ascii="Wingdings" w:hAnsi="Wingdings" w:hint="default"/>
+        <w:sz w:val="20"/>
+      </w:rPr>
+    </w:lvl>
+    <w:lvl w:ilvl="8" w:tentative="1">
+      <w:start w:val="1"/>
+      <w:numFmt w:val="bullet"/>
+      <w:lvlText w:val=""/>
+      <w:lvlJc w:val="left"/>
+      <w:pPr>
+        <w:tabs>
+          <w:tab w:val="num" w:pos="6480"/>
+        </w:tabs>
+        <w:ind w:left="6480" w:hanging="360"/>
+      </w:pPr>
+      <w:rPr>
+        <w:rFonts w:ascii="Wingdings" w:hAnsi="Wingdings" w:hint="default"/>
+        <w:sz w:val="20"/>
+      </w:rPr>
+    </w:lvl>
+  </w:abstractNum>
+  <w:abstractNum w:abstractNumId="5">
     <w:nsid w:val="3C9E3169"/>
     <w:multiLevelType w:val="multilevel"/>
     <w:tmpl w:val="AD345900"/>
@@ -2821,7 +5262,7 @@
       </w:rPr>
     </w:lvl>
   </w:abstractNum>
-  <w:abstractNum w:abstractNumId="3">
+  <w:abstractNum w:abstractNumId="6">
     <w:nsid w:val="3C9E41DD"/>
     <w:multiLevelType w:val="multilevel"/>
     <w:tmpl w:val="1C9E2FF4"/>
@@ -2970,7 +5411,7 @@
       </w:rPr>
     </w:lvl>
   </w:abstractNum>
-  <w:abstractNum w:abstractNumId="4">
+  <w:abstractNum w:abstractNumId="7">
     <w:nsid w:val="4912064C"/>
     <w:multiLevelType w:val="multilevel"/>
     <w:tmpl w:val="947CD4B8"/>
@@ -3119,20 +5560,601 @@
       </w:rPr>
     </w:lvl>
   </w:abstractNum>
+  <w:abstractNum w:abstractNumId="8">
+    <w:nsid w:val="4D9E609B"/>
+    <w:multiLevelType w:val="multilevel"/>
+    <w:tmpl w:val="B3183B2A"/>
+    <w:lvl w:ilvl="0">
+      <w:start w:val="1"/>
+      <w:numFmt w:val="bullet"/>
+      <w:lvlText w:val=""/>
+      <w:lvlJc w:val="left"/>
+      <w:pPr>
+        <w:tabs>
+          <w:tab w:val="num" w:pos="720"/>
+        </w:tabs>
+        <w:ind w:left="720" w:hanging="360"/>
+      </w:pPr>
+      <w:rPr>
+        <w:rFonts w:ascii="Symbol" w:hAnsi="Symbol" w:hint="default"/>
+        <w:sz w:val="20"/>
+      </w:rPr>
+    </w:lvl>
+    <w:lvl w:ilvl="1" w:tentative="1">
+      <w:start w:val="1"/>
+      <w:numFmt w:val="bullet"/>
+      <w:lvlText w:val="o"/>
+      <w:lvlJc w:val="left"/>
+      <w:pPr>
+        <w:tabs>
+          <w:tab w:val="num" w:pos="1440"/>
+        </w:tabs>
+        <w:ind w:left="1440" w:hanging="360"/>
+      </w:pPr>
+      <w:rPr>
+        <w:rFonts w:ascii="Courier New" w:hAnsi="Courier New" w:hint="default"/>
+        <w:sz w:val="20"/>
+      </w:rPr>
+    </w:lvl>
+    <w:lvl w:ilvl="2" w:tentative="1">
+      <w:start w:val="1"/>
+      <w:numFmt w:val="bullet"/>
+      <w:lvlText w:val=""/>
+      <w:lvlJc w:val="left"/>
+      <w:pPr>
+        <w:tabs>
+          <w:tab w:val="num" w:pos="2160"/>
+        </w:tabs>
+        <w:ind w:left="2160" w:hanging="360"/>
+      </w:pPr>
+      <w:rPr>
+        <w:rFonts w:ascii="Wingdings" w:hAnsi="Wingdings" w:hint="default"/>
+        <w:sz w:val="20"/>
+      </w:rPr>
+    </w:lvl>
+    <w:lvl w:ilvl="3" w:tentative="1">
+      <w:start w:val="1"/>
+      <w:numFmt w:val="bullet"/>
+      <w:lvlText w:val=""/>
+      <w:lvlJc w:val="left"/>
+      <w:pPr>
+        <w:tabs>
+          <w:tab w:val="num" w:pos="2880"/>
+        </w:tabs>
+        <w:ind w:left="2880" w:hanging="360"/>
+      </w:pPr>
+      <w:rPr>
+        <w:rFonts w:ascii="Wingdings" w:hAnsi="Wingdings" w:hint="default"/>
+        <w:sz w:val="20"/>
+      </w:rPr>
+    </w:lvl>
+    <w:lvl w:ilvl="4" w:tentative="1">
+      <w:start w:val="1"/>
+      <w:numFmt w:val="bullet"/>
+      <w:lvlText w:val=""/>
+      <w:lvlJc w:val="left"/>
+      <w:pPr>
+        <w:tabs>
+          <w:tab w:val="num" w:pos="3600"/>
+        </w:tabs>
+        <w:ind w:left="3600" w:hanging="360"/>
+      </w:pPr>
+      <w:rPr>
+        <w:rFonts w:ascii="Wingdings" w:hAnsi="Wingdings" w:hint="default"/>
+        <w:sz w:val="20"/>
+      </w:rPr>
+    </w:lvl>
+    <w:lvl w:ilvl="5" w:tentative="1">
+      <w:start w:val="1"/>
+      <w:numFmt w:val="bullet"/>
+      <w:lvlText w:val=""/>
+      <w:lvlJc w:val="left"/>
+      <w:pPr>
+        <w:tabs>
+          <w:tab w:val="num" w:pos="4320"/>
+        </w:tabs>
+        <w:ind w:left="4320" w:hanging="360"/>
+      </w:pPr>
+      <w:rPr>
+        <w:rFonts w:ascii="Wingdings" w:hAnsi="Wingdings" w:hint="default"/>
+        <w:sz w:val="20"/>
+      </w:rPr>
+    </w:lvl>
+    <w:lvl w:ilvl="6" w:tentative="1">
+      <w:start w:val="1"/>
+      <w:numFmt w:val="bullet"/>
+      <w:lvlText w:val=""/>
+      <w:lvlJc w:val="left"/>
+      <w:pPr>
+        <w:tabs>
+          <w:tab w:val="num" w:pos="5040"/>
+        </w:tabs>
+        <w:ind w:left="5040" w:hanging="360"/>
+      </w:pPr>
+      <w:rPr>
+        <w:rFonts w:ascii="Wingdings" w:hAnsi="Wingdings" w:hint="default"/>
+        <w:sz w:val="20"/>
+      </w:rPr>
+    </w:lvl>
+    <w:lvl w:ilvl="7" w:tentative="1">
+      <w:start w:val="1"/>
+      <w:numFmt w:val="bullet"/>
+      <w:lvlText w:val=""/>
+      <w:lvlJc w:val="left"/>
+      <w:pPr>
+        <w:tabs>
+          <w:tab w:val="num" w:pos="5760"/>
+        </w:tabs>
+        <w:ind w:left="5760" w:hanging="360"/>
+      </w:pPr>
+      <w:rPr>
+        <w:rFonts w:ascii="Wingdings" w:hAnsi="Wingdings" w:hint="default"/>
+        <w:sz w:val="20"/>
+      </w:rPr>
+    </w:lvl>
+    <w:lvl w:ilvl="8" w:tentative="1">
+      <w:start w:val="1"/>
+      <w:numFmt w:val="bullet"/>
+      <w:lvlText w:val=""/>
+      <w:lvlJc w:val="left"/>
+      <w:pPr>
+        <w:tabs>
+          <w:tab w:val="num" w:pos="6480"/>
+        </w:tabs>
+        <w:ind w:left="6480" w:hanging="360"/>
+      </w:pPr>
+      <w:rPr>
+        <w:rFonts w:ascii="Wingdings" w:hAnsi="Wingdings" w:hint="default"/>
+        <w:sz w:val="20"/>
+      </w:rPr>
+    </w:lvl>
+  </w:abstractNum>
+  <w:abstractNum w:abstractNumId="9">
+    <w:nsid w:val="64C077C5"/>
+    <w:multiLevelType w:val="hybridMultilevel"/>
+    <w:tmpl w:val="7E867E8E"/>
+    <w:lvl w:ilvl="0" w:tplc="04090001">
+      <w:start w:val="1"/>
+      <w:numFmt w:val="bullet"/>
+      <w:lvlText w:val=""/>
+      <w:lvlJc w:val="left"/>
+      <w:pPr>
+        <w:ind w:left="720" w:hanging="360"/>
+      </w:pPr>
+      <w:rPr>
+        <w:rFonts w:ascii="Symbol" w:hAnsi="Symbol" w:hint="default"/>
+      </w:rPr>
+    </w:lvl>
+    <w:lvl w:ilvl="1" w:tplc="04090003" w:tentative="1">
+      <w:start w:val="1"/>
+      <w:numFmt w:val="bullet"/>
+      <w:lvlText w:val="o"/>
+      <w:lvlJc w:val="left"/>
+      <w:pPr>
+        <w:ind w:left="1440" w:hanging="360"/>
+      </w:pPr>
+      <w:rPr>
+        <w:rFonts w:ascii="Courier New" w:hAnsi="Courier New" w:cs="Courier New" w:hint="default"/>
+      </w:rPr>
+    </w:lvl>
+    <w:lvl w:ilvl="2" w:tplc="04090005" w:tentative="1">
+      <w:start w:val="1"/>
+      <w:numFmt w:val="bullet"/>
+      <w:lvlText w:val=""/>
+      <w:lvlJc w:val="left"/>
+      <w:pPr>
+        <w:ind w:left="2160" w:hanging="360"/>
+      </w:pPr>
+      <w:rPr>
+        <w:rFonts w:ascii="Wingdings" w:hAnsi="Wingdings" w:hint="default"/>
+      </w:rPr>
+    </w:lvl>
+    <w:lvl w:ilvl="3" w:tplc="04090001" w:tentative="1">
+      <w:start w:val="1"/>
+      <w:numFmt w:val="bullet"/>
+      <w:lvlText w:val=""/>
+      <w:lvlJc w:val="left"/>
+      <w:pPr>
+        <w:ind w:left="2880" w:hanging="360"/>
+      </w:pPr>
+      <w:rPr>
+        <w:rFonts w:ascii="Symbol" w:hAnsi="Symbol" w:hint="default"/>
+      </w:rPr>
+    </w:lvl>
+    <w:lvl w:ilvl="4" w:tplc="04090003" w:tentative="1">
+      <w:start w:val="1"/>
+      <w:numFmt w:val="bullet"/>
+      <w:lvlText w:val="o"/>
+      <w:lvlJc w:val="left"/>
+      <w:pPr>
+        <w:ind w:left="3600" w:hanging="360"/>
+      </w:pPr>
+      <w:rPr>
+        <w:rFonts w:ascii="Courier New" w:hAnsi="Courier New" w:cs="Courier New" w:hint="default"/>
+      </w:rPr>
+    </w:lvl>
+    <w:lvl w:ilvl="5" w:tplc="04090005" w:tentative="1">
+      <w:start w:val="1"/>
+      <w:numFmt w:val="bullet"/>
+      <w:lvlText w:val=""/>
+      <w:lvlJc w:val="left"/>
+      <w:pPr>
+        <w:ind w:left="4320" w:hanging="360"/>
+      </w:pPr>
+      <w:rPr>
+        <w:rFonts w:ascii="Wingdings" w:hAnsi="Wingdings" w:hint="default"/>
+      </w:rPr>
+    </w:lvl>
+    <w:lvl w:ilvl="6" w:tplc="04090001" w:tentative="1">
+      <w:start w:val="1"/>
+      <w:numFmt w:val="bullet"/>
+      <w:lvlText w:val=""/>
+      <w:lvlJc w:val="left"/>
+      <w:pPr>
+        <w:ind w:left="5040" w:hanging="360"/>
+      </w:pPr>
+      <w:rPr>
+        <w:rFonts w:ascii="Symbol" w:hAnsi="Symbol" w:hint="default"/>
+      </w:rPr>
+    </w:lvl>
+    <w:lvl w:ilvl="7" w:tplc="04090003" w:tentative="1">
+      <w:start w:val="1"/>
+      <w:numFmt w:val="bullet"/>
+      <w:lvlText w:val="o"/>
+      <w:lvlJc w:val="left"/>
+      <w:pPr>
+        <w:ind w:left="5760" w:hanging="360"/>
+      </w:pPr>
+      <w:rPr>
+        <w:rFonts w:ascii="Courier New" w:hAnsi="Courier New" w:cs="Courier New" w:hint="default"/>
+      </w:rPr>
+    </w:lvl>
+    <w:lvl w:ilvl="8" w:tplc="04090005" w:tentative="1">
+      <w:start w:val="1"/>
+      <w:numFmt w:val="bullet"/>
+      <w:lvlText w:val=""/>
+      <w:lvlJc w:val="left"/>
+      <w:pPr>
+        <w:ind w:left="6480" w:hanging="360"/>
+      </w:pPr>
+      <w:rPr>
+        <w:rFonts w:ascii="Wingdings" w:hAnsi="Wingdings" w:hint="default"/>
+      </w:rPr>
+    </w:lvl>
+  </w:abstractNum>
+  <w:abstractNum w:abstractNumId="10">
+    <w:nsid w:val="6670300B"/>
+    <w:multiLevelType w:val="multilevel"/>
+    <w:tmpl w:val="C4DA8000"/>
+    <w:lvl w:ilvl="0">
+      <w:start w:val="1"/>
+      <w:numFmt w:val="bullet"/>
+      <w:lvlText w:val=""/>
+      <w:lvlJc w:val="left"/>
+      <w:pPr>
+        <w:tabs>
+          <w:tab w:val="num" w:pos="720"/>
+        </w:tabs>
+        <w:ind w:left="720" w:hanging="360"/>
+      </w:pPr>
+      <w:rPr>
+        <w:rFonts w:ascii="Symbol" w:hAnsi="Symbol" w:hint="default"/>
+        <w:sz w:val="20"/>
+      </w:rPr>
+    </w:lvl>
+    <w:lvl w:ilvl="1" w:tentative="1">
+      <w:start w:val="1"/>
+      <w:numFmt w:val="bullet"/>
+      <w:lvlText w:val="o"/>
+      <w:lvlJc w:val="left"/>
+      <w:pPr>
+        <w:tabs>
+          <w:tab w:val="num" w:pos="1440"/>
+        </w:tabs>
+        <w:ind w:left="1440" w:hanging="360"/>
+      </w:pPr>
+      <w:rPr>
+        <w:rFonts w:ascii="Courier New" w:hAnsi="Courier New" w:hint="default"/>
+        <w:sz w:val="20"/>
+      </w:rPr>
+    </w:lvl>
+    <w:lvl w:ilvl="2" w:tentative="1">
+      <w:start w:val="1"/>
+      <w:numFmt w:val="bullet"/>
+      <w:lvlText w:val=""/>
+      <w:lvlJc w:val="left"/>
+      <w:pPr>
+        <w:tabs>
+          <w:tab w:val="num" w:pos="2160"/>
+        </w:tabs>
+        <w:ind w:left="2160" w:hanging="360"/>
+      </w:pPr>
+      <w:rPr>
+        <w:rFonts w:ascii="Wingdings" w:hAnsi="Wingdings" w:hint="default"/>
+        <w:sz w:val="20"/>
+      </w:rPr>
+    </w:lvl>
+    <w:lvl w:ilvl="3" w:tentative="1">
+      <w:start w:val="1"/>
+      <w:numFmt w:val="bullet"/>
+      <w:lvlText w:val=""/>
+      <w:lvlJc w:val="left"/>
+      <w:pPr>
+        <w:tabs>
+          <w:tab w:val="num" w:pos="2880"/>
+        </w:tabs>
+        <w:ind w:left="2880" w:hanging="360"/>
+      </w:pPr>
+      <w:rPr>
+        <w:rFonts w:ascii="Wingdings" w:hAnsi="Wingdings" w:hint="default"/>
+        <w:sz w:val="20"/>
+      </w:rPr>
+    </w:lvl>
+    <w:lvl w:ilvl="4" w:tentative="1">
+      <w:start w:val="1"/>
+      <w:numFmt w:val="bullet"/>
+      <w:lvlText w:val=""/>
+      <w:lvlJc w:val="left"/>
+      <w:pPr>
+        <w:tabs>
+          <w:tab w:val="num" w:pos="3600"/>
+        </w:tabs>
+        <w:ind w:left="3600" w:hanging="360"/>
+      </w:pPr>
+      <w:rPr>
+        <w:rFonts w:ascii="Wingdings" w:hAnsi="Wingdings" w:hint="default"/>
+        <w:sz w:val="20"/>
+      </w:rPr>
+    </w:lvl>
+    <w:lvl w:ilvl="5" w:tentative="1">
+      <w:start w:val="1"/>
+      <w:numFmt w:val="bullet"/>
+      <w:lvlText w:val=""/>
+      <w:lvlJc w:val="left"/>
+      <w:pPr>
+        <w:tabs>
+          <w:tab w:val="num" w:pos="4320"/>
+        </w:tabs>
+        <w:ind w:left="4320" w:hanging="360"/>
+      </w:pPr>
+      <w:rPr>
+        <w:rFonts w:ascii="Wingdings" w:hAnsi="Wingdings" w:hint="default"/>
+        <w:sz w:val="20"/>
+      </w:rPr>
+    </w:lvl>
+    <w:lvl w:ilvl="6" w:tentative="1">
+      <w:start w:val="1"/>
+      <w:numFmt w:val="bullet"/>
+      <w:lvlText w:val=""/>
+      <w:lvlJc w:val="left"/>
+      <w:pPr>
+        <w:tabs>
+          <w:tab w:val="num" w:pos="5040"/>
+        </w:tabs>
+        <w:ind w:left="5040" w:hanging="360"/>
+      </w:pPr>
+      <w:rPr>
+        <w:rFonts w:ascii="Wingdings" w:hAnsi="Wingdings" w:hint="default"/>
+        <w:sz w:val="20"/>
+      </w:rPr>
+    </w:lvl>
+    <w:lvl w:ilvl="7" w:tentative="1">
+      <w:start w:val="1"/>
+      <w:numFmt w:val="bullet"/>
+      <w:lvlText w:val=""/>
+      <w:lvlJc w:val="left"/>
+      <w:pPr>
+        <w:tabs>
+          <w:tab w:val="num" w:pos="5760"/>
+        </w:tabs>
+        <w:ind w:left="5760" w:hanging="360"/>
+      </w:pPr>
+      <w:rPr>
+        <w:rFonts w:ascii="Wingdings" w:hAnsi="Wingdings" w:hint="default"/>
+        <w:sz w:val="20"/>
+      </w:rPr>
+    </w:lvl>
+    <w:lvl w:ilvl="8" w:tentative="1">
+      <w:start w:val="1"/>
+      <w:numFmt w:val="bullet"/>
+      <w:lvlText w:val=""/>
+      <w:lvlJc w:val="left"/>
+      <w:pPr>
+        <w:tabs>
+          <w:tab w:val="num" w:pos="6480"/>
+        </w:tabs>
+        <w:ind w:left="6480" w:hanging="360"/>
+      </w:pPr>
+      <w:rPr>
+        <w:rFonts w:ascii="Wingdings" w:hAnsi="Wingdings" w:hint="default"/>
+        <w:sz w:val="20"/>
+      </w:rPr>
+    </w:lvl>
+  </w:abstractNum>
+  <w:abstractNum w:abstractNumId="11">
+    <w:nsid w:val="74331214"/>
+    <w:multiLevelType w:val="multilevel"/>
+    <w:tmpl w:val="9A2CF266"/>
+    <w:lvl w:ilvl="0">
+      <w:start w:val="1"/>
+      <w:numFmt w:val="bullet"/>
+      <w:lvlText w:val=""/>
+      <w:lvlJc w:val="left"/>
+      <w:pPr>
+        <w:tabs>
+          <w:tab w:val="num" w:pos="720"/>
+        </w:tabs>
+        <w:ind w:left="720" w:hanging="360"/>
+      </w:pPr>
+      <w:rPr>
+        <w:rFonts w:ascii="Symbol" w:hAnsi="Symbol" w:hint="default"/>
+        <w:sz w:val="20"/>
+      </w:rPr>
+    </w:lvl>
+    <w:lvl w:ilvl="1" w:tentative="1">
+      <w:start w:val="1"/>
+      <w:numFmt w:val="bullet"/>
+      <w:lvlText w:val="o"/>
+      <w:lvlJc w:val="left"/>
+      <w:pPr>
+        <w:tabs>
+          <w:tab w:val="num" w:pos="1440"/>
+        </w:tabs>
+        <w:ind w:left="1440" w:hanging="360"/>
+      </w:pPr>
+      <w:rPr>
+        <w:rFonts w:ascii="Courier New" w:hAnsi="Courier New" w:hint="default"/>
+        <w:sz w:val="20"/>
+      </w:rPr>
+    </w:lvl>
+    <w:lvl w:ilvl="2" w:tentative="1">
+      <w:start w:val="1"/>
+      <w:numFmt w:val="bullet"/>
+      <w:lvlText w:val=""/>
+      <w:lvlJc w:val="left"/>
+      <w:pPr>
+        <w:tabs>
+          <w:tab w:val="num" w:pos="2160"/>
+        </w:tabs>
+        <w:ind w:left="2160" w:hanging="360"/>
+      </w:pPr>
+      <w:rPr>
+        <w:rFonts w:ascii="Wingdings" w:hAnsi="Wingdings" w:hint="default"/>
+        <w:sz w:val="20"/>
+      </w:rPr>
+    </w:lvl>
+    <w:lvl w:ilvl="3" w:tentative="1">
+      <w:start w:val="1"/>
+      <w:numFmt w:val="bullet"/>
+      <w:lvlText w:val=""/>
+      <w:lvlJc w:val="left"/>
+      <w:pPr>
+        <w:tabs>
+          <w:tab w:val="num" w:pos="2880"/>
+        </w:tabs>
+        <w:ind w:left="2880" w:hanging="360"/>
+      </w:pPr>
+      <w:rPr>
+        <w:rFonts w:ascii="Wingdings" w:hAnsi="Wingdings" w:hint="default"/>
+        <w:sz w:val="20"/>
+      </w:rPr>
+    </w:lvl>
+    <w:lvl w:ilvl="4" w:tentative="1">
+      <w:start w:val="1"/>
+      <w:numFmt w:val="bullet"/>
+      <w:lvlText w:val=""/>
+      <w:lvlJc w:val="left"/>
+      <w:pPr>
+        <w:tabs>
+          <w:tab w:val="num" w:pos="3600"/>
+        </w:tabs>
+        <w:ind w:left="3600" w:hanging="360"/>
+      </w:pPr>
+      <w:rPr>
+        <w:rFonts w:ascii="Wingdings" w:hAnsi="Wingdings" w:hint="default"/>
+        <w:sz w:val="20"/>
+      </w:rPr>
+    </w:lvl>
+    <w:lvl w:ilvl="5" w:tentative="1">
+      <w:start w:val="1"/>
+      <w:numFmt w:val="bullet"/>
+      <w:lvlText w:val=""/>
+      <w:lvlJc w:val="left"/>
+      <w:pPr>
+        <w:tabs>
+          <w:tab w:val="num" w:pos="4320"/>
+        </w:tabs>
+        <w:ind w:left="4320" w:hanging="360"/>
+      </w:pPr>
+      <w:rPr>
+        <w:rFonts w:ascii="Wingdings" w:hAnsi="Wingdings" w:hint="default"/>
+        <w:sz w:val="20"/>
+      </w:rPr>
+    </w:lvl>
+    <w:lvl w:ilvl="6" w:tentative="1">
+      <w:start w:val="1"/>
+      <w:numFmt w:val="bullet"/>
+      <w:lvlText w:val=""/>
+      <w:lvlJc w:val="left"/>
+      <w:pPr>
+        <w:tabs>
+          <w:tab w:val="num" w:pos="5040"/>
+        </w:tabs>
+        <w:ind w:left="5040" w:hanging="360"/>
+      </w:pPr>
+      <w:rPr>
+        <w:rFonts w:ascii="Wingdings" w:hAnsi="Wingdings" w:hint="default"/>
+        <w:sz w:val="20"/>
+      </w:rPr>
+    </w:lvl>
+    <w:lvl w:ilvl="7" w:tentative="1">
+      <w:start w:val="1"/>
+      <w:numFmt w:val="bullet"/>
+      <w:lvlText w:val=""/>
+      <w:lvlJc w:val="left"/>
+      <w:pPr>
+        <w:tabs>
+          <w:tab w:val="num" w:pos="5760"/>
+        </w:tabs>
+        <w:ind w:left="5760" w:hanging="360"/>
+      </w:pPr>
+      <w:rPr>
+        <w:rFonts w:ascii="Wingdings" w:hAnsi="Wingdings" w:hint="default"/>
+        <w:sz w:val="20"/>
+      </w:rPr>
+    </w:lvl>
+    <w:lvl w:ilvl="8" w:tentative="1">
+      <w:start w:val="1"/>
+      <w:numFmt w:val="bullet"/>
+      <w:lvlText w:val=""/>
+      <w:lvlJc w:val="left"/>
+      <w:pPr>
+        <w:tabs>
+          <w:tab w:val="num" w:pos="6480"/>
+        </w:tabs>
+        <w:ind w:left="6480" w:hanging="360"/>
+      </w:pPr>
+      <w:rPr>
+        <w:rFonts w:ascii="Wingdings" w:hAnsi="Wingdings" w:hint="default"/>
+        <w:sz w:val="20"/>
+      </w:rPr>
+    </w:lvl>
+  </w:abstractNum>
   <w:num w:numId="1">
+    <w:abstractNumId w:val="1"/>
+  </w:num>
+  <w:num w:numId="2">
+    <w:abstractNumId w:val="7"/>
+  </w:num>
+  <w:num w:numId="3">
+    <w:abstractNumId w:val="2"/>
+  </w:num>
+  <w:num w:numId="4">
+    <w:abstractNumId w:val="5"/>
+  </w:num>
+  <w:num w:numId="5">
+    <w:abstractNumId w:val="6"/>
+  </w:num>
+  <w:num w:numId="6">
+    <w:abstractNumId w:val="3"/>
+  </w:num>
+  <w:num w:numId="7">
     <w:abstractNumId w:val="0"/>
   </w:num>
-  <w:num w:numId="2">
+  <w:num w:numId="8">
+    <w:abstractNumId w:val="9"/>
+  </w:num>
+  <w:num w:numId="9">
+    <w:abstractNumId w:val="10"/>
+  </w:num>
+  <w:num w:numId="10">
+    <w:abstractNumId w:val="11"/>
+  </w:num>
+  <w:num w:numId="11">
+    <w:abstractNumId w:val="8"/>
+  </w:num>
+  <w:num w:numId="12">
     <w:abstractNumId w:val="4"/>
-  </w:num>
-  <w:num w:numId="3">
-    <w:abstractNumId w:val="1"/>
-  </w:num>
-  <w:num w:numId="4">
-    <w:abstractNumId w:val="2"/>
-  </w:num>
-  <w:num w:numId="5">
-    <w:abstractNumId w:val="3"/>
   </w:num>
 </w:numbering>
 </file>
@@ -3786,6 +6808,17 @@
       <w:spacing w:after="0" w:line="240" w:lineRule="auto"/>
     </w:pPr>
   </w:style>
+  <w:style w:type="paragraph" w:styleId="ListParagraph">
+    <w:name w:val="List Paragraph"/>
+    <w:basedOn w:val="Normal"/>
+    <w:uiPriority w:val="34"/>
+    <w:qFormat/>
+    <w:rsid w:val="005B50BB"/>
+    <w:pPr>
+      <w:ind w:left="720"/>
+      <w:contextualSpacing/>
+    </w:pPr>
+  </w:style>
 </w:styles>
 </file>
 

</xml_diff>